<commit_message>
Update to CCMC download order template
</commit_message>
<xml_diff>
--- a/docker/docmosis/templates/CV-UNS-DEC-ENG-01287.docx
+++ b/docker/docmosis/templates/CV-UNS-DEC-ENG-01287.docx
@@ -1,6 +1,6 @@
 
 <file path=word/document.xml><?xml version="1.0" encoding="utf-8"?>
-<w:document xmlns:wpc="http://schemas.microsoft.com/office/word/2010/wordprocessingCanvas" xmlns:cx="http://schemas.microsoft.com/office/drawing/2014/chartex" xmlns:cx1="http://schemas.microsoft.com/office/drawing/2015/9/8/chartex" xmlns:cx2="http://schemas.microsoft.com/office/drawing/2015/10/21/chartex" xmlns:cx3="http://schemas.microsoft.com/office/drawing/2016/5/9/chartex" xmlns:cx4="http://schemas.microsoft.com/office/drawing/2016/5/10/chartex" xmlns:cx5="http://schemas.microsoft.com/office/drawing/2016/5/11/chartex" xmlns:cx6="http://schemas.microsoft.com/office/drawing/2016/5/12/chartex" xmlns:cx7="http://schemas.microsoft.com/office/drawing/2016/5/13/chartex" xmlns:cx8="http://schemas.microsoft.com/office/drawing/2016/5/14/chartex" xmlns:mc="http://schemas.openxmlformats.org/markup-compatibility/2006" xmlns:aink="http://schemas.microsoft.com/office/drawing/2016/ink" xmlns:am3d="http://schemas.microsoft.com/office/drawing/2017/model3d" xmlns:o="urn:schemas-microsoft-com:office:office" xmlns:oel="http://schemas.microsoft.com/office/2019/extlst" xmlns:r="http://schemas.openxmlformats.org/officeDocument/2006/relationships" xmlns:m="http://schemas.openxmlformats.org/officeDocument/2006/math" xmlns:v="urn:schemas-microsoft-com:vml" xmlns:wp14="http://schemas.microsoft.com/office/word/2010/wordprocessingDrawing" xmlns:wp="http://schemas.openxmlformats.org/drawingml/2006/wordprocessingDrawing" xmlns:w10="urn:schemas-microsoft-com:office:word" xmlns:w="http://schemas.openxmlformats.org/wordprocessingml/2006/main" xmlns:w14="http://schemas.microsoft.com/office/word/2010/wordml" xmlns:w15="http://schemas.microsoft.com/office/word/2012/wordml" xmlns:w16cex="http://schemas.microsoft.com/office/word/2018/wordml/cex" xmlns:w16cid="http://schemas.microsoft.com/office/word/2016/wordml/cid" xmlns:w16="http://schemas.microsoft.com/office/word/2018/wordml" xmlns:w16du="http://schemas.microsoft.com/office/word/2023/wordml/word16du" xmlns:w16sdtdh="http://schemas.microsoft.com/office/word/2020/wordml/sdtdatahash" xmlns:w16se="http://schemas.microsoft.com/office/word/2015/wordml/symex" xmlns:wpg="http://schemas.microsoft.com/office/word/2010/wordprocessingGroup" xmlns:wpi="http://schemas.microsoft.com/office/word/2010/wordprocessingInk" xmlns:wne="http://schemas.microsoft.com/office/word/2006/wordml" xmlns:wps="http://schemas.microsoft.com/office/word/2010/wordprocessingShape" mc:Ignorable="w14 w15 w16se w16cid w16 w16cex w16sdtdh w16du wp14">
+<w:document xmlns:wpc="http://schemas.microsoft.com/office/word/2010/wordprocessingCanvas" xmlns:cx="http://schemas.microsoft.com/office/drawing/2014/chartex" xmlns:cx1="http://schemas.microsoft.com/office/drawing/2015/9/8/chartex" xmlns:cx2="http://schemas.microsoft.com/office/drawing/2015/10/21/chartex" xmlns:cx3="http://schemas.microsoft.com/office/drawing/2016/5/9/chartex" xmlns:cx4="http://schemas.microsoft.com/office/drawing/2016/5/10/chartex" xmlns:cx5="http://schemas.microsoft.com/office/drawing/2016/5/11/chartex" xmlns:cx6="http://schemas.microsoft.com/office/drawing/2016/5/12/chartex" xmlns:cx7="http://schemas.microsoft.com/office/drawing/2016/5/13/chartex" xmlns:cx8="http://schemas.microsoft.com/office/drawing/2016/5/14/chartex" xmlns:mc="http://schemas.openxmlformats.org/markup-compatibility/2006" xmlns:aink="http://schemas.microsoft.com/office/drawing/2016/ink" xmlns:am3d="http://schemas.microsoft.com/office/drawing/2017/model3d" xmlns:o="urn:schemas-microsoft-com:office:office" xmlns:oel="http://schemas.microsoft.com/office/2019/extlst" xmlns:r="http://schemas.openxmlformats.org/officeDocument/2006/relationships" xmlns:m="http://schemas.openxmlformats.org/officeDocument/2006/math" xmlns:v="urn:schemas-microsoft-com:vml" xmlns:wp14="http://schemas.microsoft.com/office/word/2010/wordprocessingDrawing" xmlns:wp="http://schemas.openxmlformats.org/drawingml/2006/wordprocessingDrawing" xmlns:w10="urn:schemas-microsoft-com:office:word" xmlns:w="http://schemas.openxmlformats.org/wordprocessingml/2006/main" xmlns:w14="http://schemas.microsoft.com/office/word/2010/wordml" xmlns:w15="http://schemas.microsoft.com/office/word/2012/wordml" xmlns:w16cex="http://schemas.microsoft.com/office/word/2018/wordml/cex" xmlns:w16cid="http://schemas.microsoft.com/office/word/2016/wordml/cid" xmlns:w16="http://schemas.microsoft.com/office/word/2018/wordml" xmlns:w16sdtdh="http://schemas.microsoft.com/office/word/2020/wordml/sdtdatahash" xmlns:w16se="http://schemas.microsoft.com/office/word/2015/wordml/symex" xmlns:wpg="http://schemas.microsoft.com/office/word/2010/wordprocessingGroup" xmlns:wpi="http://schemas.microsoft.com/office/word/2010/wordprocessingInk" xmlns:wne="http://schemas.microsoft.com/office/word/2006/wordml" xmlns:wps="http://schemas.microsoft.com/office/word/2010/wordprocessingShape" mc:Ignorable="w14 w15 w16se w16cid w16 w16cex w16sdtdh wp14">
   <w:body>
     <w:tbl>
       <w:tblPr>
@@ -123,7 +123,57 @@
               <w:rPr>
                 <w:rFonts w:ascii="GDS Transport Website Light" w:hAnsi="GDS Transport Website Light"/>
               </w:rPr>
-              <w:t>&lt;&lt;{dateFormat($nowUTC ,‘d MMMM yyyy’)} &gt;&gt;</w:t>
+              <w:t>&lt;</w:t>
+            </w:r>
+            <w:proofErr w:type="gramStart"/>
+            <w:r>
+              <w:rPr>
+                <w:rFonts w:ascii="GDS Transport Website Light" w:hAnsi="GDS Transport Website Light"/>
+              </w:rPr>
+              <w:t>&lt;{</w:t>
+            </w:r>
+            <w:proofErr w:type="spellStart"/>
+            <w:proofErr w:type="gramEnd"/>
+            <w:r>
+              <w:rPr>
+                <w:rFonts w:ascii="GDS Transport Website Light" w:hAnsi="GDS Transport Website Light"/>
+              </w:rPr>
+              <w:t>dateFormat</w:t>
+            </w:r>
+            <w:proofErr w:type="spellEnd"/>
+            <w:r>
+              <w:rPr>
+                <w:rFonts w:ascii="GDS Transport Website Light" w:hAnsi="GDS Transport Website Light"/>
+              </w:rPr>
+              <w:t>($</w:t>
+            </w:r>
+            <w:proofErr w:type="spellStart"/>
+            <w:r>
+              <w:rPr>
+                <w:rFonts w:ascii="GDS Transport Website Light" w:hAnsi="GDS Transport Website Light"/>
+              </w:rPr>
+              <w:t>nowUTC</w:t>
+            </w:r>
+            <w:proofErr w:type="spellEnd"/>
+            <w:r>
+              <w:rPr>
+                <w:rFonts w:ascii="GDS Transport Website Light" w:hAnsi="GDS Transport Website Light"/>
+              </w:rPr>
+              <w:t xml:space="preserve"> ,‘d MMMM </w:t>
+            </w:r>
+            <w:proofErr w:type="spellStart"/>
+            <w:r>
+              <w:rPr>
+                <w:rFonts w:ascii="GDS Transport Website Light" w:hAnsi="GDS Transport Website Light"/>
+              </w:rPr>
+              <w:t>yyyy</w:t>
+            </w:r>
+            <w:proofErr w:type="spellEnd"/>
+            <w:r>
+              <w:rPr>
+                <w:rFonts w:ascii="GDS Transport Website Light" w:hAnsi="GDS Transport Website Light"/>
+              </w:rPr>
+              <w:t>’)} &gt;&gt;</w:t>
             </w:r>
           </w:p>
         </w:tc>
@@ -152,8 +202,9 @@
                 <w:sz w:val="28"/>
                 <w:szCs w:val="28"/>
               </w:rPr>
-              <w:t>&lt;&lt;c</w:t>
-            </w:r>
+              <w:t>&lt;&lt;</w:t>
+            </w:r>
+            <w:proofErr w:type="spellStart"/>
             <w:r>
               <w:rPr>
                 <w:rFonts w:ascii="GDS Transport Website Light" w:hAnsi="GDS Transport Website Light"/>
@@ -162,8 +213,19 @@
                 <w:sz w:val="28"/>
                 <w:szCs w:val="28"/>
               </w:rPr>
+              <w:t>c</w:t>
+            </w:r>
+            <w:r>
+              <w:rPr>
+                <w:rFonts w:ascii="GDS Transport Website Light" w:hAnsi="GDS Transport Website Light"/>
+                <w:b/>
+                <w:bCs/>
+                <w:sz w:val="28"/>
+                <w:szCs w:val="28"/>
+              </w:rPr>
               <w:t>ourtName</w:t>
             </w:r>
+            <w:proofErr w:type="spellEnd"/>
             <w:r>
               <w:rPr>
                 <w:rFonts w:ascii="GDS Transport Website Light" w:hAnsi="GDS Transport Website Light"/>
@@ -199,6 +261,7 @@
               </w:rPr>
               <w:t>&lt;&lt;</w:t>
             </w:r>
+            <w:proofErr w:type="spellStart"/>
             <w:r>
               <w:rPr>
                 <w:rFonts w:ascii="GDS Transport Website Light" w:hAnsi="GDS Transport Website Light"/>
@@ -217,6 +280,7 @@
               </w:rPr>
               <w:t>umber</w:t>
             </w:r>
+            <w:proofErr w:type="spellEnd"/>
             <w:r>
               <w:rPr>
                 <w:rFonts w:ascii="GDS Transport Website Light" w:hAnsi="GDS Transport Website Light"/>
@@ -324,12 +388,14 @@
               </w:rPr>
               <w:t>&lt;&lt;</w:t>
             </w:r>
+            <w:proofErr w:type="spellStart"/>
             <w:r>
               <w:rPr>
                 <w:rFonts w:ascii="GDS Transport Website Light" w:hAnsi="GDS Transport Website Light"/>
               </w:rPr>
               <w:t>judgeNameTitle</w:t>
             </w:r>
+            <w:proofErr w:type="spellEnd"/>
             <w:r>
               <w:rPr>
                 <w:rFonts w:ascii="GDS Transport Website Light" w:hAnsi="GDS Transport Website Light"/>
@@ -609,6 +675,7 @@
               </w:rPr>
               <w:t>&lt;&lt;</w:t>
             </w:r>
+            <w:proofErr w:type="spellStart"/>
             <w:r>
               <w:rPr>
                 <w:rFonts w:ascii="GDSTransportWebsite" w:hAnsi="GDSTransportWebsite"/>
@@ -616,6 +683,7 @@
               </w:rPr>
               <w:t>cr</w:t>
             </w:r>
+            <w:proofErr w:type="spellEnd"/>
             <w:r>
               <w:rPr>
                 <w:rFonts w:ascii="GDSTransportWebsite" w:hAnsi="GDSTransportWebsite"/>
@@ -642,6 +710,7 @@
               </w:rPr>
               <w:t>2</w:t>
             </w:r>
+            <w:proofErr w:type="gramStart"/>
             <w:r>
               <w:rPr>
                 <w:rFonts w:ascii="GDS Transport Website Light" w:hAnsi="GDS Transport Website Light"/>
@@ -652,7 +721,14 @@
               <w:rPr>
                 <w:rFonts w:ascii="GDS Transport Website Light" w:hAnsi="GDS Transport Website Light"/>
               </w:rPr>
-              <w:t>!=null}</w:t>
+              <w:t>!=</w:t>
+            </w:r>
+            <w:proofErr w:type="gramEnd"/>
+            <w:r>
+              <w:rPr>
+                <w:rFonts w:ascii="GDS Transport Website Light" w:hAnsi="GDS Transport Website Light"/>
+              </w:rPr>
+              <w:t>null}</w:t>
             </w:r>
             <w:r>
               <w:rPr>
@@ -962,7 +1038,21 @@
               <w:rPr>
                 <w:rFonts w:ascii="GDS Transport Website Light" w:hAnsi="GDS Transport Website Light"/>
               </w:rPr>
-              <w:t>&lt;&lt;defendantNum&gt;&gt;</w:t>
+              <w:t>&lt;&lt;</w:t>
+            </w:r>
+            <w:proofErr w:type="spellStart"/>
+            <w:r>
+              <w:rPr>
+                <w:rFonts w:ascii="GDS Transport Website Light" w:hAnsi="GDS Transport Website Light"/>
+              </w:rPr>
+              <w:t>defendantNum</w:t>
+            </w:r>
+            <w:proofErr w:type="spellEnd"/>
+            <w:r>
+              <w:rPr>
+                <w:rFonts w:ascii="GDS Transport Website Light" w:hAnsi="GDS Transport Website Light"/>
+              </w:rPr>
+              <w:t>&gt;&gt;</w:t>
             </w:r>
           </w:p>
         </w:tc>
@@ -991,6 +1081,7 @@
               </w:rPr>
               <w:t>&lt;&lt;</w:t>
             </w:r>
+            <w:proofErr w:type="spellStart"/>
             <w:r>
               <w:rPr>
                 <w:rFonts w:ascii="GDSTransportWebsite" w:hAnsi="GDSTransportWebsite"/>
@@ -998,6 +1089,7 @@
               </w:rPr>
               <w:t>cr</w:t>
             </w:r>
+            <w:proofErr w:type="spellEnd"/>
             <w:r>
               <w:rPr>
                 <w:rFonts w:ascii="GDSTransportWebsite" w:hAnsi="GDSTransportWebsite"/>
@@ -1016,7 +1108,21 @@
               <w:rPr>
                 <w:rFonts w:ascii="GDS Transport Website Light" w:hAnsi="GDS Transport Website Light"/>
               </w:rPr>
-              <w:t>defendant2Name!=null}</w:t>
+              <w:t>defendant2</w:t>
+            </w:r>
+            <w:proofErr w:type="gramStart"/>
+            <w:r>
+              <w:rPr>
+                <w:rFonts w:ascii="GDS Transport Website Light" w:hAnsi="GDS Transport Website Light"/>
+              </w:rPr>
+              <w:t>Name!=</w:t>
+            </w:r>
+            <w:proofErr w:type="gramEnd"/>
+            <w:r>
+              <w:rPr>
+                <w:rFonts w:ascii="GDS Transport Website Light" w:hAnsi="GDS Transport Website Light"/>
+              </w:rPr>
+              <w:t>null}</w:t>
             </w:r>
             <w:r>
               <w:rPr>
@@ -1223,6 +1329,125 @@
     </w:p>
     <w:p>
       <w:pPr>
+        <w:autoSpaceDE w:val="0"/>
+        <w:autoSpaceDN w:val="0"/>
+        <w:adjustRightInd w:val="0"/>
+        <w:spacing w:after="0" w:line="240" w:lineRule="auto"/>
+        <w:rPr>
+          <w:rStyle w:val="ui-provider"/>
+          <w:rFonts w:ascii="Arial" w:eastAsia="Times New Roman" w:hAnsi="Arial" w:cs="Arial"/>
+          <w:kern w:val="0"/>
+          <w14:ligatures w14:val="none"/>
+        </w:rPr>
+      </w:pPr>
+      <w:r>
+        <w:rPr>
+          <w:rStyle w:val="ui-provider"/>
+          <w:rFonts w:ascii="Arial" w:eastAsia="Times New Roman" w:hAnsi="Arial" w:cs="Arial"/>
+          <w:kern w:val="0"/>
+          <w14:ligatures w14:val="none"/>
+        </w:rPr>
+        <w:t>This Order is made by &lt;&lt;</w:t>
+      </w:r>
+      <w:proofErr w:type="spellStart"/>
+      <w:r>
+        <w:rPr>
+          <w:rStyle w:val="ui-provider"/>
+          <w:rFonts w:ascii="Arial" w:eastAsia="Times New Roman" w:hAnsi="Arial" w:cs="Arial"/>
+          <w:kern w:val="0"/>
+          <w14:ligatures w14:val="none"/>
+        </w:rPr>
+        <w:t>judgeNameTitle</w:t>
+      </w:r>
+      <w:proofErr w:type="spellEnd"/>
+      <w:r>
+        <w:rPr>
+          <w:rStyle w:val="ui-provider"/>
+          <w:rFonts w:ascii="Arial" w:eastAsia="Times New Roman" w:hAnsi="Arial" w:cs="Arial"/>
+          <w:kern w:val="0"/>
+          <w14:ligatures w14:val="none"/>
+        </w:rPr>
+        <w:t>&gt;&gt;</w:t>
+      </w:r>
+      <w:r>
+        <w:rPr>
+          <w:rStyle w:val="ui-provider"/>
+          <w:rFonts w:ascii="Arial" w:eastAsia="Times New Roman" w:hAnsi="Arial" w:cs="Arial"/>
+          <w:kern w:val="0"/>
+          <w14:ligatures w14:val="none"/>
+        </w:rPr>
+        <w:t xml:space="preserve"> on </w:t>
+      </w:r>
+      <w:bookmarkStart w:id="0" w:name="_Hlk180666831"/>
+      <w:r>
+        <w:rPr>
+          <w:rFonts w:ascii="GDS Transport Website Light" w:hAnsi="GDS Transport Website Light"/>
+        </w:rPr>
+        <w:t>&lt;</w:t>
+      </w:r>
+      <w:proofErr w:type="gramStart"/>
+      <w:r>
+        <w:rPr>
+          <w:rFonts w:ascii="GDS Transport Website Light" w:hAnsi="GDS Transport Website Light"/>
+        </w:rPr>
+        <w:t>&lt;{</w:t>
+      </w:r>
+      <w:proofErr w:type="spellStart"/>
+      <w:proofErr w:type="gramEnd"/>
+      <w:r>
+        <w:rPr>
+          <w:rFonts w:ascii="GDS Transport Website Light" w:hAnsi="GDS Transport Website Light"/>
+        </w:rPr>
+        <w:t>dateFormat</w:t>
+      </w:r>
+      <w:proofErr w:type="spellEnd"/>
+      <w:r>
+        <w:rPr>
+          <w:rFonts w:ascii="GDS Transport Website Light" w:hAnsi="GDS Transport Website Light"/>
+        </w:rPr>
+        <w:t>($</w:t>
+      </w:r>
+      <w:proofErr w:type="spellStart"/>
+      <w:r>
+        <w:rPr>
+          <w:rFonts w:ascii="GDS Transport Website Light" w:hAnsi="GDS Transport Website Light"/>
+        </w:rPr>
+        <w:t>nowUTC</w:t>
+      </w:r>
+      <w:proofErr w:type="spellEnd"/>
+      <w:r>
+        <w:rPr>
+          <w:rFonts w:ascii="GDS Transport Website Light" w:hAnsi="GDS Transport Website Light"/>
+        </w:rPr>
+        <w:t xml:space="preserve"> ,‘d MMMM </w:t>
+      </w:r>
+      <w:proofErr w:type="spellStart"/>
+      <w:r>
+        <w:rPr>
+          <w:rFonts w:ascii="GDS Transport Website Light" w:hAnsi="GDS Transport Website Light"/>
+        </w:rPr>
+        <w:t>yyyy</w:t>
+      </w:r>
+      <w:proofErr w:type="spellEnd"/>
+      <w:r>
+        <w:rPr>
+          <w:rFonts w:ascii="GDS Transport Website Light" w:hAnsi="GDS Transport Website Light"/>
+        </w:rPr>
+        <w:t>’)} &gt;&gt;</w:t>
+      </w:r>
+      <w:bookmarkEnd w:id="0"/>
+      <w:r>
+        <w:rPr>
+          <w:rStyle w:val="ui-provider"/>
+          <w:rFonts w:ascii="Arial" w:eastAsia="Times New Roman" w:hAnsi="Arial" w:cs="Arial"/>
+          <w:kern w:val="0"/>
+          <w14:ligatures w14:val="none"/>
+        </w:rPr>
+        <w:br/>
+      </w:r>
+    </w:p>
+    <w:p>
+      <w:pPr>
         <w:pStyle w:val="ListParagraph"/>
         <w:numPr>
           <w:ilvl w:val="0"/>
@@ -1234,43 +1459,19 @@
         <w:spacing w:after="0" w:line="240" w:lineRule="auto"/>
         <w:jc w:val="both"/>
         <w:rPr>
-          <w:rStyle w:val="ui-provider"/>
-          <w:rFonts w:ascii="Arial" w:eastAsia="Times New Roman" w:hAnsi="Arial" w:cs="Arial"/>
-          <w:kern w:val="0"/>
-          <w14:ligatures w14:val="none"/>
-        </w:rPr>
-      </w:pPr>
-      <w:r>
-        <w:rPr>
-          <w:rStyle w:val="ui-provider"/>
           <w:rFonts w:ascii="Arial" w:hAnsi="Arial" w:cs="Arial"/>
         </w:rPr>
-        <w:t>Where this order, or any rule</w:t>
-      </w:r>
-      <w:r>
-        <w:rPr>
-          <w:rStyle w:val="ui-provider"/>
+      </w:pPr>
+      <w:r>
+        <w:rPr>
           <w:rFonts w:ascii="Arial" w:hAnsi="Arial" w:cs="Arial"/>
         </w:rPr>
-        <w:t xml:space="preserve"> or practice direction,</w:t>
-      </w:r>
-      <w:r>
-        <w:rPr>
-          <w:rStyle w:val="ui-provider"/>
-          <w:rFonts w:ascii="Arial" w:hAnsi="Arial" w:cs="Arial"/>
-        </w:rPr>
-        <w:t xml:space="preserve"> requires a party to file or serve a document</w:t>
-      </w:r>
-      <w:r>
-        <w:rPr>
-          <w:rStyle w:val="ui-provider"/>
-          <w:rFonts w:ascii="Arial" w:hAnsi="Arial" w:cs="Arial"/>
-        </w:rPr>
-        <w:t xml:space="preserve"> which can be uploaded to the Digital Portal then the document must be uploaded to the Digital Portal (and need not separately be filed).</w:t>
+        <w:t>Where this order, or any rule or practice direction, requires a party to file, serve or exchange a document which can be uploaded to the digital portal then the document must be uploaded to the digital portal (and need not separately be filed, served or exchanged).</w:t>
       </w:r>
     </w:p>
     <w:p>
       <w:pPr>
+        <w:pStyle w:val="ListParagraph"/>
         <w:autoSpaceDE w:val="0"/>
         <w:autoSpaceDN w:val="0"/>
         <w:adjustRightInd w:val="0"/>
@@ -1354,7 +1555,7 @@
           <w:kern w:val="0"/>
           <w14:ligatures w14:val="none"/>
         </w:rPr>
-        <w:t>A costs and case management conference is to be listed on the first available date after 28 days before a District Judge with an ELH of</w:t>
+        <w:t xml:space="preserve">A costs and case management conference is to be listed on the first available date after 28 days before a </w:t>
       </w:r>
       <w:r>
         <w:rPr>
@@ -1363,8 +1564,37 @@
           <w:kern w:val="0"/>
           <w14:ligatures w14:val="none"/>
         </w:rPr>
-        <w:t xml:space="preserve"> [ ]</w:t>
-      </w:r>
+        <w:t>[Circuit] [District]</w:t>
+      </w:r>
+      <w:r>
+        <w:rPr>
+          <w:rStyle w:val="ui-provider"/>
+          <w:rFonts w:ascii="Arial" w:eastAsia="Times New Roman" w:hAnsi="Arial" w:cs="Arial"/>
+          <w:kern w:val="0"/>
+          <w14:ligatures w14:val="none"/>
+        </w:rPr>
+        <w:t xml:space="preserve"> Judge with an ELH of</w:t>
+      </w:r>
+      <w:r>
+        <w:rPr>
+          <w:rStyle w:val="ui-provider"/>
+          <w:rFonts w:ascii="Arial" w:eastAsia="Times New Roman" w:hAnsi="Arial" w:cs="Arial"/>
+          <w:kern w:val="0"/>
+          <w14:ligatures w14:val="none"/>
+        </w:rPr>
+        <w:t xml:space="preserve"> </w:t>
+      </w:r>
+      <w:proofErr w:type="gramStart"/>
+      <w:r>
+        <w:rPr>
+          <w:rStyle w:val="ui-provider"/>
+          <w:rFonts w:ascii="Arial" w:eastAsia="Times New Roman" w:hAnsi="Arial" w:cs="Arial"/>
+          <w:kern w:val="0"/>
+          <w14:ligatures w14:val="none"/>
+        </w:rPr>
+        <w:t>[ ]</w:t>
+      </w:r>
+      <w:proofErr w:type="gramEnd"/>
       <w:r>
         <w:rPr>
           <w:rStyle w:val="ui-provider"/>
@@ -1411,12 +1641,20 @@
       </w:pPr>
       <w:r>
         <w:rPr>
+          <w:rFonts w:ascii="Arial" w:eastAsia="Times New Roman" w:hAnsi="Arial" w:cs="Arial"/>
+          <w:kern w:val="0"/>
+          <w14:ligatures w14:val="none"/>
+        </w:rPr>
+        <w:t>The Costs and Case Management Conference has been listed for further active case management by the Court and for approval of the parties’ costs budgets</w:t>
+      </w:r>
+      <w:r>
+        <w:rPr>
           <w:rStyle w:val="ui-provider"/>
           <w:rFonts w:ascii="Arial" w:eastAsia="Times New Roman" w:hAnsi="Arial" w:cs="Arial"/>
           <w:kern w:val="0"/>
           <w14:ligatures w14:val="none"/>
         </w:rPr>
-        <w:t>The costs and case management conference has been listed for further active case management by the Court and for approval of the parties’ costs budgets.</w:t>
+        <w:t>.</w:t>
       </w:r>
     </w:p>
     <w:p>
@@ -1443,45 +1681,51 @@
         <w:spacing w:after="0" w:line="240" w:lineRule="auto"/>
         <w:jc w:val="both"/>
         <w:rPr>
+          <w:rFonts w:ascii="Arial" w:eastAsia="Times New Roman" w:hAnsi="Arial" w:cs="Arial"/>
+          <w:kern w:val="0"/>
+          <w14:ligatures w14:val="none"/>
+        </w:rPr>
+      </w:pPr>
+      <w:r>
+        <w:rPr>
           <w:rStyle w:val="ui-provider"/>
           <w:rFonts w:ascii="Arial" w:eastAsia="Times New Roman" w:hAnsi="Arial" w:cs="Arial"/>
           <w:kern w:val="0"/>
           <w14:ligatures w14:val="none"/>
         </w:rPr>
-      </w:pPr>
-      <w:r>
-        <w:rPr>
-          <w:rStyle w:val="ui-provider"/>
-          <w:rFonts w:ascii="Arial" w:eastAsia="Times New Roman" w:hAnsi="Arial" w:cs="Arial"/>
-          <w:kern w:val="0"/>
-          <w14:ligatures w14:val="none"/>
-        </w:rPr>
-        <w:t>[The costs and case management conference will be conducted remotely by [telephone] [video hearing]]</w:t>
-      </w:r>
-      <w:r>
-        <w:rPr>
-          <w:rStyle w:val="ui-provider"/>
-          <w:rFonts w:ascii="Arial" w:eastAsia="Times New Roman" w:hAnsi="Arial" w:cs="Arial"/>
-          <w:kern w:val="0"/>
-          <w14:ligatures w14:val="none"/>
-        </w:rPr>
-        <w:t>.</w:t>
-      </w:r>
-      <w:r>
-        <w:rPr>
-          <w:rStyle w:val="ui-provider"/>
-          <w:rFonts w:ascii="Arial" w:eastAsia="Times New Roman" w:hAnsi="Arial" w:cs="Arial"/>
-          <w:kern w:val="0"/>
-          <w14:ligatures w14:val="none"/>
-        </w:rPr>
-        <w:t xml:space="preserve"> [The costs and case management conference will not be conducted remotely].</w:t>
+        <w:t>[</w:t>
+      </w:r>
+      <w:r>
+        <w:rPr>
+          <w:rFonts w:ascii="Arial" w:eastAsia="Times New Roman" w:hAnsi="Arial" w:cs="Arial"/>
+          <w:kern w:val="0"/>
+          <w14:ligatures w14:val="none"/>
+        </w:rPr>
+        <w:t>The Costs and Case Management Conference will be conducted remotely by [telephone] [video hearing</w:t>
+      </w:r>
+      <w:proofErr w:type="gramStart"/>
+      <w:r>
+        <w:rPr>
+          <w:rFonts w:ascii="Arial" w:eastAsia="Times New Roman" w:hAnsi="Arial" w:cs="Arial"/>
+          <w:kern w:val="0"/>
+          <w14:ligatures w14:val="none"/>
+        </w:rPr>
+        <w:t>]]  [</w:t>
+      </w:r>
+      <w:proofErr w:type="gramEnd"/>
+      <w:r>
+        <w:rPr>
+          <w:rFonts w:ascii="Arial" w:eastAsia="Times New Roman" w:hAnsi="Arial" w:cs="Arial"/>
+          <w:kern w:val="0"/>
+          <w14:ligatures w14:val="none"/>
+        </w:rPr>
+        <w:t xml:space="preserve">The Costs and Case Management Conference will not be conducted remotely].  </w:t>
       </w:r>
     </w:p>
     <w:p>
       <w:pPr>
         <w:pStyle w:val="ListParagraph"/>
         <w:rPr>
-          <w:rStyle w:val="ui-provider"/>
           <w:rFonts w:ascii="Arial" w:eastAsia="Times New Roman" w:hAnsi="Arial" w:cs="Arial"/>
           <w:kern w:val="0"/>
           <w14:ligatures w14:val="none"/>
@@ -1501,29 +1745,27 @@
         <w:spacing w:after="0" w:line="240" w:lineRule="auto"/>
         <w:jc w:val="both"/>
         <w:rPr>
-          <w:rStyle w:val="ui-provider"/>
-          <w:rFonts w:ascii="Arial" w:eastAsia="Times New Roman" w:hAnsi="Arial" w:cs="Arial"/>
-          <w:kern w:val="0"/>
-          <w14:ligatures w14:val="none"/>
-        </w:rPr>
-      </w:pPr>
-      <w:r>
-        <w:rPr>
-          <w:rStyle w:val="ui-provider"/>
-          <w:rFonts w:ascii="Arial" w:eastAsia="Times New Roman" w:hAnsi="Arial" w:cs="Arial"/>
-          <w:kern w:val="0"/>
-          <w14:ligatures w14:val="none"/>
-        </w:rPr>
-        <w:t xml:space="preserve">All parties must ensure that they have complied with CPR 3.13 (filing and exchanging costs budgets and budget discussion reports) save that CPR 3.13(1)(a) is disapplied and all parties except litigants in person must file and exchange budgets in accordance with CPR 3.13(1)(b), namely not later than 21 days before the first case management conference. </w:t>
+          <w:rFonts w:ascii="Arial" w:eastAsia="Times New Roman" w:hAnsi="Arial" w:cs="Arial"/>
+          <w:kern w:val="0"/>
+          <w14:ligatures w14:val="none"/>
+        </w:rPr>
+      </w:pPr>
+      <w:r>
+        <w:rPr>
+          <w:rFonts w:ascii="Arial" w:eastAsia="Times New Roman" w:hAnsi="Arial" w:cs="Arial"/>
+          <w:kern w:val="0"/>
+          <w14:ligatures w14:val="none"/>
+        </w:rPr>
+        <w:t>All parties must ensure that they have complied with CPR 3.13 (filing and exchanging costs budgets and budget discussion reports) save that CPR 3.13(1)(a) is disapplied and all parties except litigants in person must file and exchange budgets in accordance with CPR 3.13(1)(b), namely not later than 21 days before the first case management conference.</w:t>
       </w:r>
     </w:p>
     <w:p>
       <w:pPr>
         <w:pStyle w:val="ListParagraph"/>
         <w:rPr>
-          <w:rStyle w:val="ui-provider"/>
-          <w:rFonts w:ascii="Arial" w:eastAsia="Times New Roman" w:hAnsi="Arial" w:cs="Arial"/>
-          <w:kern w:val="0"/>
+          <w:rFonts w:ascii="Arial" w:eastAsia="Times New Roman" w:hAnsi="Arial" w:cs="Arial"/>
+          <w:kern w:val="0"/>
+          <w:lang w:eastAsia="en-GB"/>
           <w14:ligatures w14:val="none"/>
         </w:rPr>
       </w:pPr>
@@ -1541,246 +1783,710 @@
         <w:spacing w:after="0" w:line="240" w:lineRule="auto"/>
         <w:jc w:val="both"/>
         <w:rPr>
-          <w:rStyle w:val="ui-provider"/>
-          <w:rFonts w:ascii="Arial" w:eastAsia="Times New Roman" w:hAnsi="Arial" w:cs="Arial"/>
-          <w:kern w:val="0"/>
-          <w14:ligatures w14:val="none"/>
-        </w:rPr>
-      </w:pPr>
-      <w:r>
-        <w:rPr>
-          <w:rStyle w:val="ui-provider"/>
-          <w:rFonts w:ascii="Arial" w:eastAsia="Times New Roman" w:hAnsi="Arial" w:cs="Arial"/>
-          <w:kern w:val="0"/>
-          <w14:ligatures w14:val="none"/>
-        </w:rPr>
-        <w:t xml:space="preserve">At least 3 clear days before the costs and case management conference the Claimant must file and send to the other party or parties: </w:t>
+          <w:rFonts w:ascii="Arial" w:eastAsia="Times New Roman" w:hAnsi="Arial" w:cs="Arial"/>
+          <w:kern w:val="0"/>
+          <w14:ligatures w14:val="none"/>
+        </w:rPr>
+      </w:pPr>
+      <w:r>
+        <w:rPr>
+          <w:rFonts w:ascii="Arial" w:eastAsia="Times New Roman" w:hAnsi="Arial" w:cs="Arial"/>
+          <w:kern w:val="0"/>
+          <w:lang w:eastAsia="en-GB"/>
+          <w14:ligatures w14:val="none"/>
+        </w:rPr>
+        <w:t>The claimant shall not less than 3 clear days before the hearing upload to the digital portal a bundle which must:</w:t>
       </w:r>
     </w:p>
     <w:p>
       <w:pPr>
-        <w:pStyle w:val="ListParagraph"/>
-        <w:rPr>
-          <w:rStyle w:val="ui-provider"/>
-          <w:rFonts w:ascii="Arial" w:eastAsia="Times New Roman" w:hAnsi="Arial" w:cs="Arial"/>
-          <w:kern w:val="0"/>
-          <w14:ligatures w14:val="none"/>
-        </w:rPr>
-      </w:pPr>
+        <w:numPr>
+          <w:ilvl w:val="1"/>
+          <w:numId w:val="5"/>
+        </w:numPr>
+        <w:spacing w:after="0" w:line="240" w:lineRule="auto"/>
+        <w:jc w:val="both"/>
+        <w:rPr>
+          <w:rFonts w:ascii="Arial" w:eastAsia="Times New Roman" w:hAnsi="Arial" w:cs="Arial"/>
+          <w:kern w:val="0"/>
+          <w:lang w:eastAsia="en-GB"/>
+          <w14:ligatures w14:val="none"/>
+        </w:rPr>
+      </w:pPr>
+      <w:r>
+        <w:rPr>
+          <w:rFonts w:ascii="Arial" w:eastAsia="Times New Roman" w:hAnsi="Arial" w:cs="Arial"/>
+          <w:kern w:val="0"/>
+          <w:lang w:eastAsia="en-GB"/>
+          <w14:ligatures w14:val="none"/>
+        </w:rPr>
+        <w:t>Have a file name containing the type of hearing (e.g. CCMC) and the words “hearing bundle”</w:t>
+      </w:r>
     </w:p>
     <w:p>
       <w:pPr>
+        <w:numPr>
+          <w:ilvl w:val="1"/>
+          <w:numId w:val="5"/>
+        </w:numPr>
+        <w:spacing w:after="0" w:line="240" w:lineRule="auto"/>
+        <w:jc w:val="both"/>
+        <w:rPr>
+          <w:rFonts w:ascii="Arial" w:eastAsia="Times New Roman" w:hAnsi="Arial" w:cs="Arial"/>
+          <w:kern w:val="0"/>
+          <w:lang w:eastAsia="en-GB"/>
+          <w14:ligatures w14:val="none"/>
+        </w:rPr>
+      </w:pPr>
+      <w:r>
+        <w:rPr>
+          <w:rFonts w:ascii="Arial" w:eastAsia="Times New Roman" w:hAnsi="Arial" w:cs="Arial"/>
+          <w:kern w:val="0"/>
+          <w:lang w:eastAsia="en-GB"/>
+          <w14:ligatures w14:val="none"/>
+        </w:rPr>
+        <w:t xml:space="preserve">Include </w:t>
+      </w:r>
+    </w:p>
+    <w:p>
+      <w:pPr>
+        <w:numPr>
+          <w:ilvl w:val="2"/>
+          <w:numId w:val="5"/>
+        </w:numPr>
+        <w:spacing w:after="0" w:line="240" w:lineRule="auto"/>
+        <w:jc w:val="both"/>
+        <w:rPr>
+          <w:rFonts w:ascii="Arial" w:eastAsia="Times New Roman" w:hAnsi="Arial" w:cs="Arial"/>
+          <w:kern w:val="0"/>
+          <w:lang w:eastAsia="en-GB"/>
+          <w14:ligatures w14:val="none"/>
+        </w:rPr>
+      </w:pPr>
+      <w:r>
+        <w:rPr>
+          <w:rFonts w:ascii="Arial" w:eastAsia="Times New Roman" w:hAnsi="Arial" w:cs="Arial"/>
+          <w:kern w:val="0"/>
+          <w:lang w:eastAsia="en-GB"/>
+          <w14:ligatures w14:val="none"/>
+        </w:rPr>
+        <w:t>Draft directions, preferably agreed, by all parties</w:t>
+      </w:r>
+    </w:p>
+    <w:p>
+      <w:pPr>
+        <w:numPr>
+          <w:ilvl w:val="2"/>
+          <w:numId w:val="5"/>
+        </w:numPr>
+        <w:spacing w:after="0" w:line="240" w:lineRule="auto"/>
+        <w:jc w:val="both"/>
+        <w:rPr>
+          <w:rFonts w:ascii="Arial" w:eastAsia="Times New Roman" w:hAnsi="Arial" w:cs="Arial"/>
+          <w:kern w:val="0"/>
+          <w:lang w:eastAsia="en-GB"/>
+          <w14:ligatures w14:val="none"/>
+        </w:rPr>
+      </w:pPr>
+      <w:r>
+        <w:rPr>
+          <w:rFonts w:ascii="Arial" w:eastAsia="Times New Roman" w:hAnsi="Arial" w:cs="Arial"/>
+          <w:kern w:val="0"/>
+          <w:lang w:eastAsia="en-GB"/>
+          <w14:ligatures w14:val="none"/>
+        </w:rPr>
+        <w:t>A chronology</w:t>
+      </w:r>
+    </w:p>
+    <w:p>
+      <w:pPr>
+        <w:numPr>
+          <w:ilvl w:val="2"/>
+          <w:numId w:val="5"/>
+        </w:numPr>
+        <w:spacing w:after="0" w:line="240" w:lineRule="auto"/>
+        <w:jc w:val="both"/>
+        <w:rPr>
+          <w:rFonts w:ascii="Arial" w:eastAsia="Times New Roman" w:hAnsi="Arial" w:cs="Arial"/>
+          <w:kern w:val="0"/>
+          <w:lang w:eastAsia="en-GB"/>
+          <w14:ligatures w14:val="none"/>
+        </w:rPr>
+      </w:pPr>
+      <w:r>
+        <w:rPr>
+          <w:rFonts w:ascii="Arial" w:eastAsia="Times New Roman" w:hAnsi="Arial" w:cs="Arial"/>
+          <w:kern w:val="0"/>
+          <w:lang w:eastAsia="en-GB"/>
+          <w14:ligatures w14:val="none"/>
+        </w:rPr>
+        <w:t>A case summary (limited to 500 words)</w:t>
+      </w:r>
+    </w:p>
+    <w:p>
+      <w:pPr>
+        <w:numPr>
+          <w:ilvl w:val="2"/>
+          <w:numId w:val="5"/>
+        </w:numPr>
+        <w:spacing w:after="0" w:line="240" w:lineRule="auto"/>
+        <w:jc w:val="both"/>
+        <w:rPr>
+          <w:rFonts w:ascii="Arial" w:eastAsia="Times New Roman" w:hAnsi="Arial" w:cs="Arial"/>
+          <w:kern w:val="0"/>
+          <w:lang w:eastAsia="en-GB"/>
+          <w14:ligatures w14:val="none"/>
+        </w:rPr>
+      </w:pPr>
+      <w:r>
+        <w:rPr>
+          <w:rFonts w:ascii="Arial" w:eastAsia="Times New Roman" w:hAnsi="Arial" w:cs="Arial"/>
+          <w:kern w:val="0"/>
+          <w:lang w:eastAsia="en-GB"/>
+          <w14:ligatures w14:val="none"/>
+        </w:rPr>
+        <w:lastRenderedPageBreak/>
+        <w:t xml:space="preserve">A </w:t>
+      </w:r>
+      <w:proofErr w:type="gramStart"/>
+      <w:r>
+        <w:rPr>
+          <w:rFonts w:ascii="Arial" w:eastAsia="Times New Roman" w:hAnsi="Arial" w:cs="Arial"/>
+          <w:kern w:val="0"/>
+          <w:lang w:eastAsia="en-GB"/>
+          <w14:ligatures w14:val="none"/>
+        </w:rPr>
+        <w:t>one page</w:t>
+      </w:r>
+      <w:proofErr w:type="gramEnd"/>
+      <w:r>
+        <w:rPr>
+          <w:rFonts w:ascii="Arial" w:eastAsia="Times New Roman" w:hAnsi="Arial" w:cs="Arial"/>
+          <w:kern w:val="0"/>
+          <w:lang w:eastAsia="en-GB"/>
+          <w14:ligatures w14:val="none"/>
+        </w:rPr>
+        <w:t xml:space="preserve"> summary of the Precedents H of both parties to enable the judge to undertake a comparison of the total for each party of each phase of the litigation</w:t>
+      </w:r>
+    </w:p>
+    <w:p>
+      <w:pPr>
+        <w:numPr>
+          <w:ilvl w:val="2"/>
+          <w:numId w:val="5"/>
+        </w:numPr>
+        <w:spacing w:after="0" w:line="240" w:lineRule="auto"/>
+        <w:jc w:val="both"/>
+        <w:rPr>
+          <w:rFonts w:ascii="Arial" w:eastAsia="Times New Roman" w:hAnsi="Arial" w:cs="Arial"/>
+          <w:kern w:val="0"/>
+          <w:lang w:eastAsia="en-GB"/>
+          <w14:ligatures w14:val="none"/>
+        </w:rPr>
+      </w:pPr>
+      <w:r>
+        <w:rPr>
+          <w:rFonts w:ascii="Arial" w:eastAsia="Times New Roman" w:hAnsi="Arial" w:cs="Arial"/>
+          <w:kern w:val="0"/>
+          <w:lang w:eastAsia="en-GB"/>
+          <w14:ligatures w14:val="none"/>
+        </w:rPr>
+        <w:t>A breakdown of the pre-action and issue/pleadings costs included in the respective Forms H.</w:t>
+      </w:r>
+    </w:p>
+    <w:p>
+      <w:pPr>
+        <w:numPr>
+          <w:ilvl w:val="1"/>
+          <w:numId w:val="5"/>
+        </w:numPr>
+        <w:spacing w:after="0" w:line="240" w:lineRule="auto"/>
+        <w:jc w:val="both"/>
+        <w:rPr>
+          <w:rFonts w:ascii="Arial" w:eastAsia="Times New Roman" w:hAnsi="Arial" w:cs="Arial"/>
+          <w:kern w:val="0"/>
+          <w:lang w:eastAsia="en-GB"/>
+          <w14:ligatures w14:val="none"/>
+        </w:rPr>
+      </w:pPr>
+      <w:r>
+        <w:rPr>
+          <w:rFonts w:ascii="Arial" w:eastAsia="Times New Roman" w:hAnsi="Arial" w:cs="Arial"/>
+          <w:kern w:val="0"/>
+          <w:lang w:eastAsia="en-GB"/>
+          <w14:ligatures w14:val="none"/>
+        </w:rPr>
+        <w:t xml:space="preserve">be indexed, paginated and bookmarked. The pagination should start at page 1 for the first page of the bundle and must run sequentially thereafter. </w:t>
+      </w:r>
+    </w:p>
+    <w:p>
+      <w:pPr>
+        <w:numPr>
+          <w:ilvl w:val="1"/>
+          <w:numId w:val="5"/>
+        </w:numPr>
+        <w:spacing w:after="0" w:line="240" w:lineRule="auto"/>
+        <w:jc w:val="both"/>
+        <w:rPr>
+          <w:rFonts w:ascii="Arial" w:eastAsia="Times New Roman" w:hAnsi="Arial" w:cs="Arial"/>
+          <w:kern w:val="0"/>
+          <w:lang w:eastAsia="en-GB"/>
+          <w14:ligatures w14:val="none"/>
+        </w:rPr>
+      </w:pPr>
+      <w:r>
+        <w:rPr>
+          <w:rFonts w:ascii="Arial" w:eastAsia="Times New Roman" w:hAnsi="Arial" w:cs="Arial"/>
+          <w:kern w:val="0"/>
+          <w:lang w:eastAsia="en-GB"/>
+          <w14:ligatures w14:val="none"/>
+        </w:rPr>
+        <w:t xml:space="preserve">comply with paras 1-10 of the court’s general guidance on electronic court bundles </w:t>
+      </w:r>
+      <w:r>
+        <w:rPr>
+          <w:rFonts w:ascii="Arial" w:eastAsia="Times New Roman" w:hAnsi="Arial" w:cs="Arial"/>
+          <w:sz w:val="24"/>
+          <w:szCs w:val="24"/>
+          <w:lang w:val="en-US" w:eastAsia="en-GB"/>
+        </w:rPr>
+        <w:t>(</w:t>
+      </w:r>
+      <w:hyperlink r:id="rId8" w:history="1">
+        <w:r>
+          <w:rPr>
+            <w:rFonts w:ascii="Arial" w:eastAsia="Times New Roman" w:hAnsi="Arial" w:cs="Arial"/>
+            <w:color w:val="0563C1"/>
+            <w:sz w:val="24"/>
+            <w:szCs w:val="24"/>
+            <w:u w:val="single" w:color="0563C0"/>
+            <w:lang w:val="en-US" w:eastAsia="en-GB"/>
+          </w:rPr>
+          <w:t>https://www.judiciary.uk/guidance-and-resources/general-guidance-on-electronic-court-bundles/</w:t>
+        </w:r>
+      </w:hyperlink>
+      <w:r>
+        <w:rPr>
+          <w:rFonts w:ascii="Arial" w:eastAsia="Times New Roman" w:hAnsi="Arial" w:cs="Arial"/>
+          <w:sz w:val="24"/>
+          <w:szCs w:val="24"/>
+          <w:lang w:eastAsia="en-GB"/>
+        </w:rPr>
+        <w:t>) ;and</w:t>
+      </w:r>
+    </w:p>
+    <w:p>
+      <w:pPr>
+        <w:numPr>
+          <w:ilvl w:val="1"/>
+          <w:numId w:val="5"/>
+        </w:numPr>
+        <w:spacing w:after="0" w:line="240" w:lineRule="auto"/>
+        <w:jc w:val="both"/>
+        <w:rPr>
+          <w:rFonts w:ascii="Arial" w:eastAsia="Times New Roman" w:hAnsi="Arial" w:cs="Arial"/>
+          <w:kern w:val="0"/>
+          <w:lang w:eastAsia="en-GB"/>
+          <w14:ligatures w14:val="none"/>
+        </w:rPr>
+      </w:pPr>
+      <w:r>
+        <w:rPr>
+          <w:rFonts w:ascii="Arial" w:eastAsia="Times New Roman" w:hAnsi="Arial" w:cs="Arial"/>
+          <w:kern w:val="0"/>
+          <w:lang w:eastAsia="en-GB"/>
+          <w14:ligatures w14:val="none"/>
+        </w:rPr>
+        <w:t xml:space="preserve">Otherwise comply with the requirements of Civil Procedure Rules Practice Direction 32 paragraph 27. </w:t>
+      </w:r>
+    </w:p>
+    <w:p>
+      <w:pPr>
+        <w:spacing w:after="0" w:line="240" w:lineRule="auto"/>
+        <w:ind w:left="1440"/>
+        <w:jc w:val="both"/>
+        <w:rPr>
+          <w:rFonts w:ascii="Arial" w:eastAsia="Times New Roman" w:hAnsi="Arial" w:cs="Arial"/>
+          <w:kern w:val="0"/>
+          <w:lang w:eastAsia="en-GB"/>
+          <w14:ligatures w14:val="none"/>
+        </w:rPr>
+      </w:pPr>
+    </w:p>
+    <w:p>
+      <w:pPr>
+        <w:numPr>
+          <w:ilvl w:val="0"/>
+          <w:numId w:val="3"/>
+        </w:numPr>
+        <w:spacing w:after="0" w:line="240" w:lineRule="auto"/>
+        <w:jc w:val="both"/>
+        <w:rPr>
+          <w:rFonts w:ascii="Arial" w:eastAsia="Times New Roman" w:hAnsi="Arial" w:cs="Arial"/>
+          <w:kern w:val="0"/>
+          <w14:ligatures w14:val="none"/>
+        </w:rPr>
+      </w:pPr>
+      <w:r>
+        <w:rPr>
+          <w:rFonts w:ascii="Arial" w:eastAsia="Times New Roman" w:hAnsi="Arial" w:cs="Arial"/>
+          <w:kern w:val="0"/>
+          <w14:ligatures w14:val="none"/>
+        </w:rPr>
+        <w:t>If at the time</w:t>
+      </w:r>
+      <w:r>
+        <w:rPr>
+          <w:rFonts w:ascii="Arial" w:hAnsi="Arial" w:cs="Arial"/>
+        </w:rPr>
+        <w:t xml:space="preserve"> </w:t>
+      </w:r>
+      <w:r>
+        <w:rPr>
+          <w:rFonts w:ascii="Arial" w:eastAsia="Times New Roman" w:hAnsi="Arial" w:cs="Arial"/>
+          <w:kern w:val="0"/>
+          <w14:ligatures w14:val="none"/>
+        </w:rPr>
+        <w:t xml:space="preserve">for compliance with the above direction the claim is not proceeding in the digital </w:t>
+      </w:r>
+      <w:proofErr w:type="gramStart"/>
+      <w:r>
+        <w:rPr>
+          <w:rFonts w:ascii="Arial" w:eastAsia="Times New Roman" w:hAnsi="Arial" w:cs="Arial"/>
+          <w:kern w:val="0"/>
+          <w14:ligatures w14:val="none"/>
+        </w:rPr>
+        <w:t>portal</w:t>
+      </w:r>
+      <w:proofErr w:type="gramEnd"/>
+      <w:r>
+        <w:rPr>
+          <w:rFonts w:ascii="Arial" w:eastAsia="Times New Roman" w:hAnsi="Arial" w:cs="Arial"/>
+          <w:kern w:val="0"/>
+          <w14:ligatures w14:val="none"/>
+        </w:rPr>
+        <w:t xml:space="preserve"> then instead of uploading a bundle to the digital portal it must be filed at court.</w:t>
+      </w:r>
+    </w:p>
+    <w:p>
+      <w:pPr>
+        <w:spacing w:after="0" w:line="240" w:lineRule="auto"/>
+        <w:ind w:left="720"/>
+        <w:jc w:val="both"/>
+        <w:rPr>
+          <w:rFonts w:ascii="Arial" w:eastAsia="Times New Roman" w:hAnsi="Arial" w:cs="Arial"/>
+          <w:kern w:val="0"/>
+          <w14:ligatures w14:val="none"/>
+        </w:rPr>
+      </w:pPr>
+    </w:p>
+    <w:p>
+      <w:pPr>
+        <w:numPr>
+          <w:ilvl w:val="0"/>
+          <w:numId w:val="3"/>
+        </w:numPr>
+        <w:spacing w:after="0" w:line="240" w:lineRule="auto"/>
+        <w:jc w:val="both"/>
+        <w:rPr>
+          <w:rFonts w:ascii="Arial" w:eastAsia="Times New Roman" w:hAnsi="Arial" w:cs="Arial"/>
+          <w:kern w:val="0"/>
+          <w14:ligatures w14:val="none"/>
+        </w:rPr>
+      </w:pPr>
+      <w:r>
+        <w:rPr>
+          <w:rFonts w:ascii="Arial" w:eastAsia="Times New Roman" w:hAnsi="Arial" w:cs="Arial"/>
+          <w:kern w:val="0"/>
+          <w14:ligatures w14:val="none"/>
+        </w:rPr>
+        <w:t>[The claimant shall no less than 3 days before the hearing file at court a paper version of the bundle in addition to any electronic bundle prepared in accordance with the above paragraphs]</w:t>
+      </w:r>
+    </w:p>
+    <w:p>
+      <w:pPr>
+        <w:pStyle w:val="ListParagraph"/>
+        <w:rPr>
+          <w:rFonts w:ascii="Arial" w:eastAsia="Times New Roman" w:hAnsi="Arial" w:cs="Arial"/>
+          <w:kern w:val="0"/>
+          <w14:ligatures w14:val="none"/>
+        </w:rPr>
+      </w:pPr>
+    </w:p>
+    <w:p>
+      <w:pPr>
         <w:pStyle w:val="ListParagraph"/>
         <w:numPr>
-          <w:ilvl w:val="1"/>
+          <w:ilvl w:val="0"/>
           <w:numId w:val="3"/>
         </w:numPr>
-        <w:autoSpaceDE w:val="0"/>
-        <w:autoSpaceDN w:val="0"/>
-        <w:adjustRightInd w:val="0"/>
+        <w:tabs>
+          <w:tab w:val="left" w:pos="7395"/>
+          <w:tab w:val="left" w:pos="8655"/>
+        </w:tabs>
         <w:spacing w:after="0" w:line="240" w:lineRule="auto"/>
         <w:jc w:val="both"/>
         <w:rPr>
-          <w:rStyle w:val="ui-provider"/>
-          <w:rFonts w:ascii="Arial" w:eastAsia="Times New Roman" w:hAnsi="Arial" w:cs="Arial"/>
-          <w:kern w:val="0"/>
-          <w14:ligatures w14:val="none"/>
-        </w:rPr>
-      </w:pPr>
-      <w:r>
-        <w:rPr>
-          <w:rStyle w:val="ui-provider"/>
-          <w:rFonts w:ascii="Arial" w:eastAsia="Times New Roman" w:hAnsi="Arial" w:cs="Arial"/>
-          <w:kern w:val="0"/>
-          <w14:ligatures w14:val="none"/>
-        </w:rPr>
-        <w:t>A copy of the core bundle</w:t>
-      </w:r>
+          <w:rFonts w:ascii="Arial" w:eastAsia="Times New Roman" w:hAnsi="Arial" w:cs="Arial"/>
+          <w:kern w:val="0"/>
+          <w14:ligatures w14:val="none"/>
+        </w:rPr>
+      </w:pPr>
+      <w:bookmarkStart w:id="1" w:name="_Hlk180080420"/>
+      <w:r>
+        <w:rPr>
+          <w:rFonts w:ascii="Arial" w:hAnsi="Arial" w:cs="Arial"/>
+        </w:rPr>
+        <w:t>[If the Claimant is unrepresented and the Defendant is legally represented, then the Defendant must, where applicable, comply with the requirements set out above in relation to the hearing bundle.]</w:t>
+      </w:r>
+      <w:bookmarkEnd w:id="1"/>
     </w:p>
     <w:p>
       <w:pPr>
-        <w:pStyle w:val="ListParagraph"/>
-        <w:numPr>
-          <w:ilvl w:val="1"/>
-          <w:numId w:val="3"/>
-        </w:numPr>
-        <w:autoSpaceDE w:val="0"/>
-        <w:autoSpaceDN w:val="0"/>
-        <w:adjustRightInd w:val="0"/>
+        <w:spacing w:after="0" w:line="240" w:lineRule="auto"/>
+        <w:ind w:left="720"/>
+        <w:jc w:val="both"/>
+        <w:rPr>
+          <w:rFonts w:ascii="Arial" w:eastAsia="Times New Roman" w:hAnsi="Arial" w:cs="Arial"/>
+          <w:kern w:val="0"/>
+          <w:lang w:eastAsia="en-GB"/>
+          <w14:ligatures w14:val="none"/>
+        </w:rPr>
+      </w:pPr>
+    </w:p>
+    <w:p>
+      <w:pPr>
+        <w:rPr>
+          <w:rFonts w:ascii="Arial" w:hAnsi="Arial" w:cs="Arial"/>
+        </w:rPr>
+      </w:pPr>
+    </w:p>
+    <w:p>
+      <w:pPr>
+        <w:tabs>
+          <w:tab w:val="left" w:pos="7395"/>
+          <w:tab w:val="left" w:pos="8655"/>
+        </w:tabs>
         <w:spacing w:after="0" w:line="240" w:lineRule="auto"/>
         <w:jc w:val="both"/>
         <w:rPr>
-          <w:rStyle w:val="ui-provider"/>
-          <w:rFonts w:ascii="Arial" w:eastAsia="Times New Roman" w:hAnsi="Arial" w:cs="Arial"/>
-          <w:kern w:val="0"/>
-          <w14:ligatures w14:val="none"/>
-        </w:rPr>
-      </w:pPr>
-      <w:r>
-        <w:rPr>
-          <w:rStyle w:val="ui-provider"/>
-          <w:rFonts w:ascii="Arial" w:eastAsia="Times New Roman" w:hAnsi="Arial" w:cs="Arial"/>
-          <w:kern w:val="0"/>
-          <w14:ligatures w14:val="none"/>
-        </w:rPr>
-        <w:t>Draft directions</w:t>
+          <w:rFonts w:ascii="Arial" w:eastAsia="Times New Roman" w:hAnsi="Arial" w:cs="Arial"/>
+          <w:b/>
+          <w:bCs/>
+          <w:kern w:val="0"/>
+          <w:lang w:eastAsia="en-GB"/>
+          <w14:ligatures w14:val="none"/>
+        </w:rPr>
+      </w:pPr>
+      <w:r>
+        <w:rPr>
+          <w:rFonts w:ascii="Arial" w:eastAsia="Times New Roman" w:hAnsi="Arial" w:cs="Arial"/>
+          <w:b/>
+          <w:bCs/>
+          <w:kern w:val="0"/>
+          <w:lang w:eastAsia="en-GB"/>
+          <w14:ligatures w14:val="none"/>
+        </w:rPr>
+        <w:t>This order has been made without hearing. Each party has the right to apply to have</w:t>
       </w:r>
     </w:p>
     <w:p>
       <w:pPr>
-        <w:pStyle w:val="ListParagraph"/>
-        <w:numPr>
-          <w:ilvl w:val="1"/>
-          <w:numId w:val="3"/>
-        </w:numPr>
-        <w:autoSpaceDE w:val="0"/>
-        <w:autoSpaceDN w:val="0"/>
-        <w:adjustRightInd w:val="0"/>
+        <w:tabs>
+          <w:tab w:val="left" w:pos="7395"/>
+          <w:tab w:val="left" w:pos="8655"/>
+        </w:tabs>
         <w:spacing w:after="0" w:line="240" w:lineRule="auto"/>
         <w:jc w:val="both"/>
         <w:rPr>
-          <w:rStyle w:val="ui-provider"/>
-          <w:rFonts w:ascii="Arial" w:eastAsia="Times New Roman" w:hAnsi="Arial" w:cs="Arial"/>
-          <w:kern w:val="0"/>
-          <w14:ligatures w14:val="none"/>
-        </w:rPr>
-      </w:pPr>
-      <w:r>
-        <w:rPr>
-          <w:rStyle w:val="ui-provider"/>
-          <w:rFonts w:ascii="Arial" w:eastAsia="Times New Roman" w:hAnsi="Arial" w:cs="Arial"/>
-          <w:kern w:val="0"/>
-          <w14:ligatures w14:val="none"/>
-        </w:rPr>
-        <w:t>A chronology</w:t>
+          <w:rFonts w:ascii="Arial" w:eastAsia="Times New Roman" w:hAnsi="Arial" w:cs="Arial"/>
+          <w:b/>
+          <w:bCs/>
+          <w:kern w:val="0"/>
+          <w:lang w:eastAsia="en-GB"/>
+          <w14:ligatures w14:val="none"/>
+        </w:rPr>
+      </w:pPr>
+      <w:r>
+        <w:rPr>
+          <w:rFonts w:ascii="Arial" w:eastAsia="Times New Roman" w:hAnsi="Arial" w:cs="Arial"/>
+          <w:b/>
+          <w:bCs/>
+          <w:kern w:val="0"/>
+          <w:lang w:eastAsia="en-GB"/>
+          <w14:ligatures w14:val="none"/>
+        </w:rPr>
+        <w:t>this Order set aside or varied. Any such application must be received by the Court</w:t>
       </w:r>
     </w:p>
     <w:p>
       <w:pPr>
-        <w:pStyle w:val="ListParagraph"/>
-        <w:numPr>
-          <w:ilvl w:val="1"/>
-          <w:numId w:val="3"/>
-        </w:numPr>
-        <w:autoSpaceDE w:val="0"/>
-        <w:autoSpaceDN w:val="0"/>
-        <w:adjustRightInd w:val="0"/>
+        <w:tabs>
+          <w:tab w:val="left" w:pos="7395"/>
+          <w:tab w:val="left" w:pos="8655"/>
+        </w:tabs>
         <w:spacing w:after="0" w:line="240" w:lineRule="auto"/>
         <w:jc w:val="both"/>
         <w:rPr>
-          <w:rStyle w:val="ui-provider"/>
-          <w:rFonts w:ascii="Arial" w:eastAsia="Times New Roman" w:hAnsi="Arial" w:cs="Arial"/>
-          <w:kern w:val="0"/>
-          <w14:ligatures w14:val="none"/>
-        </w:rPr>
-      </w:pPr>
-      <w:r>
-        <w:rPr>
-          <w:rStyle w:val="ui-provider"/>
-          <w:rFonts w:ascii="Arial" w:eastAsia="Times New Roman" w:hAnsi="Arial" w:cs="Arial"/>
-          <w:kern w:val="0"/>
-          <w14:ligatures w14:val="none"/>
-        </w:rPr>
-        <w:t>A case summary (limited to 500 words)</w:t>
-      </w:r>
-    </w:p>
-    <w:p>
-      <w:pPr>
-        <w:pStyle w:val="ListParagraph"/>
-        <w:numPr>
-          <w:ilvl w:val="1"/>
-          <w:numId w:val="3"/>
-        </w:numPr>
-        <w:autoSpaceDE w:val="0"/>
-        <w:autoSpaceDN w:val="0"/>
-        <w:adjustRightInd w:val="0"/>
-        <w:spacing w:after="0" w:line="240" w:lineRule="auto"/>
-        <w:jc w:val="both"/>
-        <w:rPr>
-          <w:rStyle w:val="ui-provider"/>
-          <w:rFonts w:ascii="Arial" w:eastAsia="Times New Roman" w:hAnsi="Arial" w:cs="Arial"/>
-          <w:kern w:val="0"/>
-          <w14:ligatures w14:val="none"/>
-        </w:rPr>
-      </w:pPr>
-      <w:r>
-        <w:rPr>
-          <w:rStyle w:val="ui-provider"/>
-          <w:rFonts w:ascii="Arial" w:eastAsia="Times New Roman" w:hAnsi="Arial" w:cs="Arial"/>
-          <w:kern w:val="0"/>
-          <w14:ligatures w14:val="none"/>
-        </w:rPr>
-        <w:t>A one page summary of the Precedents H of both parties to enable the judge to undertake a comparison of the total for each party of each phase of the litigation</w:t>
-      </w:r>
-    </w:p>
-    <w:p>
-      <w:pPr>
-        <w:pStyle w:val="ListParagraph"/>
-        <w:numPr>
-          <w:ilvl w:val="1"/>
-          <w:numId w:val="3"/>
-        </w:numPr>
-        <w:autoSpaceDE w:val="0"/>
-        <w:autoSpaceDN w:val="0"/>
-        <w:adjustRightInd w:val="0"/>
-        <w:spacing w:after="0" w:line="240" w:lineRule="auto"/>
-        <w:jc w:val="both"/>
-        <w:rPr>
-          <w:rStyle w:val="ui-provider"/>
-          <w:rFonts w:ascii="Arial" w:eastAsia="Times New Roman" w:hAnsi="Arial" w:cs="Arial"/>
-          <w:kern w:val="0"/>
-          <w14:ligatures w14:val="none"/>
-        </w:rPr>
-      </w:pPr>
-      <w:r>
-        <w:rPr>
-          <w:rStyle w:val="ui-provider"/>
-          <w:rFonts w:ascii="Arial" w:eastAsia="Times New Roman" w:hAnsi="Arial" w:cs="Arial"/>
-          <w:kern w:val="0"/>
-          <w14:ligatures w14:val="none"/>
-        </w:rPr>
-        <w:t>A breakdown of the pre-action and issue/pleadings costs included in the respective Forms H.</w:t>
-      </w:r>
-    </w:p>
-    <w:p>
-      <w:pPr>
-        <w:rPr>
-          <w:rFonts w:ascii="Arial" w:hAnsi="Arial" w:cs="Arial"/>
-        </w:rPr>
-      </w:pPr>
-    </w:p>
-    <w:p>
-      <w:pPr>
-        <w:spacing w:after="0" w:line="240" w:lineRule="auto"/>
+          <w:rFonts w:ascii="Arial" w:eastAsia="Times New Roman" w:hAnsi="Arial" w:cs="Arial"/>
+          <w:kern w:val="0"/>
+          <w:lang w:eastAsia="en-GB"/>
+          <w14:ligatures w14:val="none"/>
+        </w:rPr>
+      </w:pPr>
+      <w:r>
         <w:rPr>
           <w:rFonts w:ascii="Arial" w:eastAsia="Times New Roman" w:hAnsi="Arial" w:cs="Arial"/>
           <w:b/>
           <w:bCs/>
           <w:kern w:val="0"/>
-          <w14:ligatures w14:val="none"/>
-        </w:rPr>
-      </w:pPr>
+          <w:lang w:eastAsia="en-GB"/>
+          <w14:ligatures w14:val="none"/>
+        </w:rPr>
+        <w:t>(together with the appropriate fee) by 4pm on &lt;</w:t>
+      </w:r>
+      <w:proofErr w:type="gramStart"/>
       <w:r>
         <w:rPr>
           <w:rFonts w:ascii="Arial" w:eastAsia="Times New Roman" w:hAnsi="Arial" w:cs="Arial"/>
           <w:b/>
           <w:bCs/>
           <w:kern w:val="0"/>
-          <w14:ligatures w14:val="none"/>
-        </w:rPr>
-        <w:t>Because this Order has been made without a hearing, the parties have the right to apply to have the Order set aside, varied or stayed.  A party making such an application must send or deliver the application to the court (together with any appropriate fee) to arrive within 7 days of service of this Order.</w:t>
+          <w:lang w:eastAsia="en-GB"/>
+          <w14:ligatures w14:val="none"/>
+        </w:rPr>
+        <w:t>&lt;{</w:t>
+      </w:r>
+      <w:proofErr w:type="spellStart"/>
+      <w:proofErr w:type="gramEnd"/>
+      <w:r>
+        <w:rPr>
+          <w:rFonts w:ascii="Arial" w:eastAsia="Times New Roman" w:hAnsi="Arial" w:cs="Arial"/>
+          <w:b/>
+          <w:bCs/>
+          <w:kern w:val="0"/>
+          <w:lang w:eastAsia="en-GB"/>
+          <w14:ligatures w14:val="none"/>
+        </w:rPr>
+        <w:t>dateFormat</w:t>
+      </w:r>
+      <w:proofErr w:type="spellEnd"/>
+      <w:r>
+        <w:rPr>
+          <w:rFonts w:ascii="Arial" w:eastAsia="Times New Roman" w:hAnsi="Arial" w:cs="Arial"/>
+          <w:b/>
+          <w:bCs/>
+          <w:kern w:val="0"/>
+          <w:lang w:eastAsia="en-GB"/>
+          <w14:ligatures w14:val="none"/>
+        </w:rPr>
+        <w:t>(</w:t>
+      </w:r>
+      <w:proofErr w:type="spellStart"/>
+      <w:r>
+        <w:rPr>
+          <w:rFonts w:ascii="Arial" w:eastAsia="Times New Roman" w:hAnsi="Arial" w:cs="Arial"/>
+          <w:b/>
+          <w:bCs/>
+          <w:kern w:val="0"/>
+          <w:lang w:eastAsia="en-GB"/>
+          <w14:ligatures w14:val="none"/>
+        </w:rPr>
+        <w:t>addDays</w:t>
+      </w:r>
+      <w:proofErr w:type="spellEnd"/>
+      <w:r>
+        <w:rPr>
+          <w:rFonts w:ascii="Arial" w:eastAsia="Times New Roman" w:hAnsi="Arial" w:cs="Arial"/>
+          <w:b/>
+          <w:bCs/>
+          <w:kern w:val="0"/>
+          <w:lang w:eastAsia="en-GB"/>
+          <w14:ligatures w14:val="none"/>
+        </w:rPr>
+        <w:t>(</w:t>
+      </w:r>
+      <w:r>
+        <w:rPr>
+          <w:rFonts w:ascii="Arial" w:eastAsia="Times New Roman" w:hAnsi="Arial" w:cs="Arial"/>
+          <w:b/>
+          <w:bCs/>
+          <w:kern w:val="0"/>
+          <w:lang w:eastAsia="en-GB"/>
+          <w14:ligatures w14:val="none"/>
+        </w:rPr>
+        <w:t>$</w:t>
+      </w:r>
+      <w:proofErr w:type="spellStart"/>
+      <w:r>
+        <w:rPr>
+          <w:rFonts w:ascii="Arial" w:eastAsia="Times New Roman" w:hAnsi="Arial" w:cs="Arial"/>
+          <w:b/>
+          <w:bCs/>
+          <w:kern w:val="0"/>
+          <w:lang w:eastAsia="en-GB"/>
+          <w14:ligatures w14:val="none"/>
+        </w:rPr>
+        <w:t>nowUTC</w:t>
+      </w:r>
+      <w:proofErr w:type="spellEnd"/>
+      <w:r>
+        <w:rPr>
+          <w:rFonts w:ascii="Arial" w:eastAsia="Times New Roman" w:hAnsi="Arial" w:cs="Arial"/>
+          <w:b/>
+          <w:bCs/>
+          <w:kern w:val="0"/>
+          <w:lang w:eastAsia="en-GB"/>
+          <w14:ligatures w14:val="none"/>
+        </w:rPr>
+        <w:t>, 7)</w:t>
+      </w:r>
+      <w:r>
+        <w:rPr>
+          <w:rFonts w:ascii="Arial" w:eastAsia="Times New Roman" w:hAnsi="Arial" w:cs="Arial"/>
+          <w:b/>
+          <w:bCs/>
+          <w:kern w:val="0"/>
+          <w:lang w:eastAsia="en-GB"/>
+          <w14:ligatures w14:val="none"/>
+        </w:rPr>
+        <w:t xml:space="preserve"> ,‘d MMMM </w:t>
+      </w:r>
+      <w:proofErr w:type="spellStart"/>
+      <w:r>
+        <w:rPr>
+          <w:rFonts w:ascii="Arial" w:eastAsia="Times New Roman" w:hAnsi="Arial" w:cs="Arial"/>
+          <w:b/>
+          <w:bCs/>
+          <w:kern w:val="0"/>
+          <w:lang w:eastAsia="en-GB"/>
+          <w14:ligatures w14:val="none"/>
+        </w:rPr>
+        <w:t>yyyy</w:t>
+      </w:r>
+      <w:proofErr w:type="spellEnd"/>
+      <w:r>
+        <w:rPr>
+          <w:rFonts w:ascii="Arial" w:eastAsia="Times New Roman" w:hAnsi="Arial" w:cs="Arial"/>
+          <w:b/>
+          <w:bCs/>
+          <w:kern w:val="0"/>
+          <w:lang w:eastAsia="en-GB"/>
+          <w14:ligatures w14:val="none"/>
+        </w:rPr>
+        <w:t>’)} &gt;&gt;.</w:t>
       </w:r>
     </w:p>
     <w:p/>
     <w:p/>
     <w:p/>
     <w:sectPr>
-      <w:headerReference w:type="even" r:id="rId8"/>
-      <w:headerReference w:type="default" r:id="rId9"/>
-      <w:footerReference w:type="even" r:id="rId10"/>
-      <w:footerReference w:type="default" r:id="rId11"/>
-      <w:headerReference w:type="first" r:id="rId12"/>
-      <w:footerReference w:type="first" r:id="rId13"/>
+      <w:headerReference w:type="even" r:id="rId9"/>
+      <w:headerReference w:type="default" r:id="rId10"/>
+      <w:footerReference w:type="even" r:id="rId11"/>
+      <w:footerReference w:type="default" r:id="rId12"/>
+      <w:headerReference w:type="first" r:id="rId13"/>
+      <w:footerReference w:type="first" r:id="rId14"/>
       <w:pgSz w:w="11906" w:h="16838"/>
       <w:pgMar w:top="1440" w:right="1440" w:bottom="1440" w:left="1440" w:header="708" w:footer="708" w:gutter="0"/>
       <w:cols w:space="708"/>
@@ -1791,7 +2497,7 @@
 </file>
 
 <file path=word/endnotes.xml><?xml version="1.0" encoding="utf-8"?>
-<w:endnotes xmlns:wpc="http://schemas.microsoft.com/office/word/2010/wordprocessingCanvas" xmlns:cx="http://schemas.microsoft.com/office/drawing/2014/chartex" xmlns:cx1="http://schemas.microsoft.com/office/drawing/2015/9/8/chartex" xmlns:cx2="http://schemas.microsoft.com/office/drawing/2015/10/21/chartex" xmlns:cx3="http://schemas.microsoft.com/office/drawing/2016/5/9/chartex" xmlns:cx4="http://schemas.microsoft.com/office/drawing/2016/5/10/chartex" xmlns:cx5="http://schemas.microsoft.com/office/drawing/2016/5/11/chartex" xmlns:cx6="http://schemas.microsoft.com/office/drawing/2016/5/12/chartex" xmlns:cx7="http://schemas.microsoft.com/office/drawing/2016/5/13/chartex" xmlns:cx8="http://schemas.microsoft.com/office/drawing/2016/5/14/chartex" xmlns:mc="http://schemas.openxmlformats.org/markup-compatibility/2006" xmlns:aink="http://schemas.microsoft.com/office/drawing/2016/ink" xmlns:am3d="http://schemas.microsoft.com/office/drawing/2017/model3d" xmlns:o="urn:schemas-microsoft-com:office:office" xmlns:oel="http://schemas.microsoft.com/office/2019/extlst" xmlns:r="http://schemas.openxmlformats.org/officeDocument/2006/relationships" xmlns:m="http://schemas.openxmlformats.org/officeDocument/2006/math" xmlns:v="urn:schemas-microsoft-com:vml" xmlns:wp14="http://schemas.microsoft.com/office/word/2010/wordprocessingDrawing" xmlns:wp="http://schemas.openxmlformats.org/drawingml/2006/wordprocessingDrawing" xmlns:w10="urn:schemas-microsoft-com:office:word" xmlns:w="http://schemas.openxmlformats.org/wordprocessingml/2006/main" xmlns:w14="http://schemas.microsoft.com/office/word/2010/wordml" xmlns:w15="http://schemas.microsoft.com/office/word/2012/wordml" xmlns:w16cex="http://schemas.microsoft.com/office/word/2018/wordml/cex" xmlns:w16cid="http://schemas.microsoft.com/office/word/2016/wordml/cid" xmlns:w16="http://schemas.microsoft.com/office/word/2018/wordml" xmlns:w16du="http://schemas.microsoft.com/office/word/2023/wordml/word16du" xmlns:w16sdtdh="http://schemas.microsoft.com/office/word/2020/wordml/sdtdatahash" xmlns:w16se="http://schemas.microsoft.com/office/word/2015/wordml/symex" xmlns:wpg="http://schemas.microsoft.com/office/word/2010/wordprocessingGroup" xmlns:wpi="http://schemas.microsoft.com/office/word/2010/wordprocessingInk" xmlns:wne="http://schemas.microsoft.com/office/word/2006/wordml" xmlns:wps="http://schemas.microsoft.com/office/word/2010/wordprocessingShape" mc:Ignorable="w14 w15 w16se w16cid w16 w16cex w16sdtdh w16du wp14">
+<w:endnotes xmlns:wpc="http://schemas.microsoft.com/office/word/2010/wordprocessingCanvas" xmlns:cx="http://schemas.microsoft.com/office/drawing/2014/chartex" xmlns:cx1="http://schemas.microsoft.com/office/drawing/2015/9/8/chartex" xmlns:cx2="http://schemas.microsoft.com/office/drawing/2015/10/21/chartex" xmlns:cx3="http://schemas.microsoft.com/office/drawing/2016/5/9/chartex" xmlns:cx4="http://schemas.microsoft.com/office/drawing/2016/5/10/chartex" xmlns:cx5="http://schemas.microsoft.com/office/drawing/2016/5/11/chartex" xmlns:cx6="http://schemas.microsoft.com/office/drawing/2016/5/12/chartex" xmlns:cx7="http://schemas.microsoft.com/office/drawing/2016/5/13/chartex" xmlns:cx8="http://schemas.microsoft.com/office/drawing/2016/5/14/chartex" xmlns:mc="http://schemas.openxmlformats.org/markup-compatibility/2006" xmlns:aink="http://schemas.microsoft.com/office/drawing/2016/ink" xmlns:am3d="http://schemas.microsoft.com/office/drawing/2017/model3d" xmlns:o="urn:schemas-microsoft-com:office:office" xmlns:oel="http://schemas.microsoft.com/office/2019/extlst" xmlns:r="http://schemas.openxmlformats.org/officeDocument/2006/relationships" xmlns:m="http://schemas.openxmlformats.org/officeDocument/2006/math" xmlns:v="urn:schemas-microsoft-com:vml" xmlns:wp14="http://schemas.microsoft.com/office/word/2010/wordprocessingDrawing" xmlns:wp="http://schemas.openxmlformats.org/drawingml/2006/wordprocessingDrawing" xmlns:w10="urn:schemas-microsoft-com:office:word" xmlns:w="http://schemas.openxmlformats.org/wordprocessingml/2006/main" xmlns:w14="http://schemas.microsoft.com/office/word/2010/wordml" xmlns:w15="http://schemas.microsoft.com/office/word/2012/wordml" xmlns:w16cex="http://schemas.microsoft.com/office/word/2018/wordml/cex" xmlns:w16cid="http://schemas.microsoft.com/office/word/2016/wordml/cid" xmlns:w16="http://schemas.microsoft.com/office/word/2018/wordml" xmlns:w16sdtdh="http://schemas.microsoft.com/office/word/2020/wordml/sdtdatahash" xmlns:w16se="http://schemas.microsoft.com/office/word/2015/wordml/symex" xmlns:wpg="http://schemas.microsoft.com/office/word/2010/wordprocessingGroup" xmlns:wpi="http://schemas.microsoft.com/office/word/2010/wordprocessingInk" xmlns:wne="http://schemas.microsoft.com/office/word/2006/wordml" xmlns:wps="http://schemas.microsoft.com/office/word/2010/wordprocessingShape" mc:Ignorable="w14 w15 w16se w16cid w16 w16cex w16sdtdh wp14">
   <w:endnote w:type="separator" w:id="-1">
     <w:p>
       <w:pPr>
@@ -1816,7 +2522,7 @@
 </file>
 
 <file path=word/footer1.xml><?xml version="1.0" encoding="utf-8"?>
-<w:ftr xmlns:wpc="http://schemas.microsoft.com/office/word/2010/wordprocessingCanvas" xmlns:cx="http://schemas.microsoft.com/office/drawing/2014/chartex" xmlns:cx1="http://schemas.microsoft.com/office/drawing/2015/9/8/chartex" xmlns:cx2="http://schemas.microsoft.com/office/drawing/2015/10/21/chartex" xmlns:cx3="http://schemas.microsoft.com/office/drawing/2016/5/9/chartex" xmlns:cx4="http://schemas.microsoft.com/office/drawing/2016/5/10/chartex" xmlns:cx5="http://schemas.microsoft.com/office/drawing/2016/5/11/chartex" xmlns:cx6="http://schemas.microsoft.com/office/drawing/2016/5/12/chartex" xmlns:cx7="http://schemas.microsoft.com/office/drawing/2016/5/13/chartex" xmlns:cx8="http://schemas.microsoft.com/office/drawing/2016/5/14/chartex" xmlns:mc="http://schemas.openxmlformats.org/markup-compatibility/2006" xmlns:aink="http://schemas.microsoft.com/office/drawing/2016/ink" xmlns:am3d="http://schemas.microsoft.com/office/drawing/2017/model3d" xmlns:o="urn:schemas-microsoft-com:office:office" xmlns:oel="http://schemas.microsoft.com/office/2019/extlst" xmlns:r="http://schemas.openxmlformats.org/officeDocument/2006/relationships" xmlns:m="http://schemas.openxmlformats.org/officeDocument/2006/math" xmlns:v="urn:schemas-microsoft-com:vml" xmlns:wp14="http://schemas.microsoft.com/office/word/2010/wordprocessingDrawing" xmlns:wp="http://schemas.openxmlformats.org/drawingml/2006/wordprocessingDrawing" xmlns:w10="urn:schemas-microsoft-com:office:word" xmlns:w="http://schemas.openxmlformats.org/wordprocessingml/2006/main" xmlns:w14="http://schemas.microsoft.com/office/word/2010/wordml" xmlns:w15="http://schemas.microsoft.com/office/word/2012/wordml" xmlns:w16cex="http://schemas.microsoft.com/office/word/2018/wordml/cex" xmlns:w16cid="http://schemas.microsoft.com/office/word/2016/wordml/cid" xmlns:w16="http://schemas.microsoft.com/office/word/2018/wordml" xmlns:w16du="http://schemas.microsoft.com/office/word/2023/wordml/word16du" xmlns:w16sdtdh="http://schemas.microsoft.com/office/word/2020/wordml/sdtdatahash" xmlns:w16se="http://schemas.microsoft.com/office/word/2015/wordml/symex" xmlns:wpg="http://schemas.microsoft.com/office/word/2010/wordprocessingGroup" xmlns:wpi="http://schemas.microsoft.com/office/word/2010/wordprocessingInk" xmlns:wne="http://schemas.microsoft.com/office/word/2006/wordml" xmlns:wps="http://schemas.microsoft.com/office/word/2010/wordprocessingShape" mc:Ignorable="w14 w15 w16se w16cid w16 w16cex w16sdtdh w16du wp14">
+<w:ftr xmlns:wpc="http://schemas.microsoft.com/office/word/2010/wordprocessingCanvas" xmlns:cx="http://schemas.microsoft.com/office/drawing/2014/chartex" xmlns:cx1="http://schemas.microsoft.com/office/drawing/2015/9/8/chartex" xmlns:cx2="http://schemas.microsoft.com/office/drawing/2015/10/21/chartex" xmlns:cx3="http://schemas.microsoft.com/office/drawing/2016/5/9/chartex" xmlns:cx4="http://schemas.microsoft.com/office/drawing/2016/5/10/chartex" xmlns:cx5="http://schemas.microsoft.com/office/drawing/2016/5/11/chartex" xmlns:cx6="http://schemas.microsoft.com/office/drawing/2016/5/12/chartex" xmlns:cx7="http://schemas.microsoft.com/office/drawing/2016/5/13/chartex" xmlns:cx8="http://schemas.microsoft.com/office/drawing/2016/5/14/chartex" xmlns:mc="http://schemas.openxmlformats.org/markup-compatibility/2006" xmlns:aink="http://schemas.microsoft.com/office/drawing/2016/ink" xmlns:am3d="http://schemas.microsoft.com/office/drawing/2017/model3d" xmlns:o="urn:schemas-microsoft-com:office:office" xmlns:oel="http://schemas.microsoft.com/office/2019/extlst" xmlns:r="http://schemas.openxmlformats.org/officeDocument/2006/relationships" xmlns:m="http://schemas.openxmlformats.org/officeDocument/2006/math" xmlns:v="urn:schemas-microsoft-com:vml" xmlns:wp14="http://schemas.microsoft.com/office/word/2010/wordprocessingDrawing" xmlns:wp="http://schemas.openxmlformats.org/drawingml/2006/wordprocessingDrawing" xmlns:w10="urn:schemas-microsoft-com:office:word" xmlns:w="http://schemas.openxmlformats.org/wordprocessingml/2006/main" xmlns:w14="http://schemas.microsoft.com/office/word/2010/wordml" xmlns:w15="http://schemas.microsoft.com/office/word/2012/wordml" xmlns:w16cex="http://schemas.microsoft.com/office/word/2018/wordml/cex" xmlns:w16cid="http://schemas.microsoft.com/office/word/2016/wordml/cid" xmlns:w16="http://schemas.microsoft.com/office/word/2018/wordml" xmlns:w16sdtdh="http://schemas.microsoft.com/office/word/2020/wordml/sdtdatahash" xmlns:w16se="http://schemas.microsoft.com/office/word/2015/wordml/symex" xmlns:wpg="http://schemas.microsoft.com/office/word/2010/wordprocessingGroup" xmlns:wpi="http://schemas.microsoft.com/office/word/2010/wordprocessingInk" xmlns:wne="http://schemas.microsoft.com/office/word/2006/wordml" xmlns:wps="http://schemas.microsoft.com/office/word/2010/wordprocessingShape" mc:Ignorable="w14 w15 w16se w16cid w16 w16cex w16sdtdh wp14">
   <w:p>
     <w:pPr>
       <w:pStyle w:val="Footer"/>
@@ -1946,7 +2652,7 @@
 </file>
 
 <file path=word/footer2.xml><?xml version="1.0" encoding="utf-8"?>
-<w:ftr xmlns:wpc="http://schemas.microsoft.com/office/word/2010/wordprocessingCanvas" xmlns:cx="http://schemas.microsoft.com/office/drawing/2014/chartex" xmlns:cx1="http://schemas.microsoft.com/office/drawing/2015/9/8/chartex" xmlns:cx2="http://schemas.microsoft.com/office/drawing/2015/10/21/chartex" xmlns:cx3="http://schemas.microsoft.com/office/drawing/2016/5/9/chartex" xmlns:cx4="http://schemas.microsoft.com/office/drawing/2016/5/10/chartex" xmlns:cx5="http://schemas.microsoft.com/office/drawing/2016/5/11/chartex" xmlns:cx6="http://schemas.microsoft.com/office/drawing/2016/5/12/chartex" xmlns:cx7="http://schemas.microsoft.com/office/drawing/2016/5/13/chartex" xmlns:cx8="http://schemas.microsoft.com/office/drawing/2016/5/14/chartex" xmlns:mc="http://schemas.openxmlformats.org/markup-compatibility/2006" xmlns:aink="http://schemas.microsoft.com/office/drawing/2016/ink" xmlns:am3d="http://schemas.microsoft.com/office/drawing/2017/model3d" xmlns:o="urn:schemas-microsoft-com:office:office" xmlns:oel="http://schemas.microsoft.com/office/2019/extlst" xmlns:r="http://schemas.openxmlformats.org/officeDocument/2006/relationships" xmlns:m="http://schemas.openxmlformats.org/officeDocument/2006/math" xmlns:v="urn:schemas-microsoft-com:vml" xmlns:wp14="http://schemas.microsoft.com/office/word/2010/wordprocessingDrawing" xmlns:wp="http://schemas.openxmlformats.org/drawingml/2006/wordprocessingDrawing" xmlns:w10="urn:schemas-microsoft-com:office:word" xmlns:w="http://schemas.openxmlformats.org/wordprocessingml/2006/main" xmlns:w14="http://schemas.microsoft.com/office/word/2010/wordml" xmlns:w15="http://schemas.microsoft.com/office/word/2012/wordml" xmlns:w16cex="http://schemas.microsoft.com/office/word/2018/wordml/cex" xmlns:w16cid="http://schemas.microsoft.com/office/word/2016/wordml/cid" xmlns:w16="http://schemas.microsoft.com/office/word/2018/wordml" xmlns:w16du="http://schemas.microsoft.com/office/word/2023/wordml/word16du" xmlns:w16sdtdh="http://schemas.microsoft.com/office/word/2020/wordml/sdtdatahash" xmlns:w16se="http://schemas.microsoft.com/office/word/2015/wordml/symex" xmlns:wpg="http://schemas.microsoft.com/office/word/2010/wordprocessingGroup" xmlns:wpi="http://schemas.microsoft.com/office/word/2010/wordprocessingInk" xmlns:wne="http://schemas.microsoft.com/office/word/2006/wordml" xmlns:wps="http://schemas.microsoft.com/office/word/2010/wordprocessingShape" mc:Ignorable="w14 w15 w16se w16cid w16 w16cex w16sdtdh w16du wp14">
+<w:ftr xmlns:wpc="http://schemas.microsoft.com/office/word/2010/wordprocessingCanvas" xmlns:cx="http://schemas.microsoft.com/office/drawing/2014/chartex" xmlns:cx1="http://schemas.microsoft.com/office/drawing/2015/9/8/chartex" xmlns:cx2="http://schemas.microsoft.com/office/drawing/2015/10/21/chartex" xmlns:cx3="http://schemas.microsoft.com/office/drawing/2016/5/9/chartex" xmlns:cx4="http://schemas.microsoft.com/office/drawing/2016/5/10/chartex" xmlns:cx5="http://schemas.microsoft.com/office/drawing/2016/5/11/chartex" xmlns:cx6="http://schemas.microsoft.com/office/drawing/2016/5/12/chartex" xmlns:cx7="http://schemas.microsoft.com/office/drawing/2016/5/13/chartex" xmlns:cx8="http://schemas.microsoft.com/office/drawing/2016/5/14/chartex" xmlns:mc="http://schemas.openxmlformats.org/markup-compatibility/2006" xmlns:aink="http://schemas.microsoft.com/office/drawing/2016/ink" xmlns:am3d="http://schemas.microsoft.com/office/drawing/2017/model3d" xmlns:o="urn:schemas-microsoft-com:office:office" xmlns:oel="http://schemas.microsoft.com/office/2019/extlst" xmlns:r="http://schemas.openxmlformats.org/officeDocument/2006/relationships" xmlns:m="http://schemas.openxmlformats.org/officeDocument/2006/math" xmlns:v="urn:schemas-microsoft-com:vml" xmlns:wp14="http://schemas.microsoft.com/office/word/2010/wordprocessingDrawing" xmlns:wp="http://schemas.openxmlformats.org/drawingml/2006/wordprocessingDrawing" xmlns:w10="urn:schemas-microsoft-com:office:word" xmlns:w="http://schemas.openxmlformats.org/wordprocessingml/2006/main" xmlns:w14="http://schemas.microsoft.com/office/word/2010/wordml" xmlns:w15="http://schemas.microsoft.com/office/word/2012/wordml" xmlns:w16cex="http://schemas.microsoft.com/office/word/2018/wordml/cex" xmlns:w16cid="http://schemas.microsoft.com/office/word/2016/wordml/cid" xmlns:w16="http://schemas.microsoft.com/office/word/2018/wordml" xmlns:w16sdtdh="http://schemas.microsoft.com/office/word/2020/wordml/sdtdatahash" xmlns:w16se="http://schemas.microsoft.com/office/word/2015/wordml/symex" xmlns:wpg="http://schemas.microsoft.com/office/word/2010/wordprocessingGroup" xmlns:wpi="http://schemas.microsoft.com/office/word/2010/wordprocessingInk" xmlns:wne="http://schemas.microsoft.com/office/word/2006/wordml" xmlns:wps="http://schemas.microsoft.com/office/word/2010/wordprocessingShape" mc:Ignorable="w14 w15 w16se w16cid w16 w16cex w16sdtdh wp14">
   <w:p>
     <w:pPr>
       <w:pStyle w:val="Footer"/>
@@ -1956,7 +2662,7 @@
 </file>
 
 <file path=word/footer3.xml><?xml version="1.0" encoding="utf-8"?>
-<w:ftr xmlns:wpc="http://schemas.microsoft.com/office/word/2010/wordprocessingCanvas" xmlns:cx="http://schemas.microsoft.com/office/drawing/2014/chartex" xmlns:cx1="http://schemas.microsoft.com/office/drawing/2015/9/8/chartex" xmlns:cx2="http://schemas.microsoft.com/office/drawing/2015/10/21/chartex" xmlns:cx3="http://schemas.microsoft.com/office/drawing/2016/5/9/chartex" xmlns:cx4="http://schemas.microsoft.com/office/drawing/2016/5/10/chartex" xmlns:cx5="http://schemas.microsoft.com/office/drawing/2016/5/11/chartex" xmlns:cx6="http://schemas.microsoft.com/office/drawing/2016/5/12/chartex" xmlns:cx7="http://schemas.microsoft.com/office/drawing/2016/5/13/chartex" xmlns:cx8="http://schemas.microsoft.com/office/drawing/2016/5/14/chartex" xmlns:mc="http://schemas.openxmlformats.org/markup-compatibility/2006" xmlns:aink="http://schemas.microsoft.com/office/drawing/2016/ink" xmlns:am3d="http://schemas.microsoft.com/office/drawing/2017/model3d" xmlns:o="urn:schemas-microsoft-com:office:office" xmlns:oel="http://schemas.microsoft.com/office/2019/extlst" xmlns:r="http://schemas.openxmlformats.org/officeDocument/2006/relationships" xmlns:m="http://schemas.openxmlformats.org/officeDocument/2006/math" xmlns:v="urn:schemas-microsoft-com:vml" xmlns:wp14="http://schemas.microsoft.com/office/word/2010/wordprocessingDrawing" xmlns:wp="http://schemas.openxmlformats.org/drawingml/2006/wordprocessingDrawing" xmlns:w10="urn:schemas-microsoft-com:office:word" xmlns:w="http://schemas.openxmlformats.org/wordprocessingml/2006/main" xmlns:w14="http://schemas.microsoft.com/office/word/2010/wordml" xmlns:w15="http://schemas.microsoft.com/office/word/2012/wordml" xmlns:w16cex="http://schemas.microsoft.com/office/word/2018/wordml/cex" xmlns:w16cid="http://schemas.microsoft.com/office/word/2016/wordml/cid" xmlns:w16="http://schemas.microsoft.com/office/word/2018/wordml" xmlns:w16du="http://schemas.microsoft.com/office/word/2023/wordml/word16du" xmlns:w16sdtdh="http://schemas.microsoft.com/office/word/2020/wordml/sdtdatahash" xmlns:w16se="http://schemas.microsoft.com/office/word/2015/wordml/symex" xmlns:wpg="http://schemas.microsoft.com/office/word/2010/wordprocessingGroup" xmlns:wpi="http://schemas.microsoft.com/office/word/2010/wordprocessingInk" xmlns:wne="http://schemas.microsoft.com/office/word/2006/wordml" xmlns:wps="http://schemas.microsoft.com/office/word/2010/wordprocessingShape" mc:Ignorable="w14 w15 w16se w16cid w16 w16cex w16sdtdh w16du wp14">
+<w:ftr xmlns:wpc="http://schemas.microsoft.com/office/word/2010/wordprocessingCanvas" xmlns:cx="http://schemas.microsoft.com/office/drawing/2014/chartex" xmlns:cx1="http://schemas.microsoft.com/office/drawing/2015/9/8/chartex" xmlns:cx2="http://schemas.microsoft.com/office/drawing/2015/10/21/chartex" xmlns:cx3="http://schemas.microsoft.com/office/drawing/2016/5/9/chartex" xmlns:cx4="http://schemas.microsoft.com/office/drawing/2016/5/10/chartex" xmlns:cx5="http://schemas.microsoft.com/office/drawing/2016/5/11/chartex" xmlns:cx6="http://schemas.microsoft.com/office/drawing/2016/5/12/chartex" xmlns:cx7="http://schemas.microsoft.com/office/drawing/2016/5/13/chartex" xmlns:cx8="http://schemas.microsoft.com/office/drawing/2016/5/14/chartex" xmlns:mc="http://schemas.openxmlformats.org/markup-compatibility/2006" xmlns:aink="http://schemas.microsoft.com/office/drawing/2016/ink" xmlns:am3d="http://schemas.microsoft.com/office/drawing/2017/model3d" xmlns:o="urn:schemas-microsoft-com:office:office" xmlns:oel="http://schemas.microsoft.com/office/2019/extlst" xmlns:r="http://schemas.openxmlformats.org/officeDocument/2006/relationships" xmlns:m="http://schemas.openxmlformats.org/officeDocument/2006/math" xmlns:v="urn:schemas-microsoft-com:vml" xmlns:wp14="http://schemas.microsoft.com/office/word/2010/wordprocessingDrawing" xmlns:wp="http://schemas.openxmlformats.org/drawingml/2006/wordprocessingDrawing" xmlns:w10="urn:schemas-microsoft-com:office:word" xmlns:w="http://schemas.openxmlformats.org/wordprocessingml/2006/main" xmlns:w14="http://schemas.microsoft.com/office/word/2010/wordml" xmlns:w15="http://schemas.microsoft.com/office/word/2012/wordml" xmlns:w16cex="http://schemas.microsoft.com/office/word/2018/wordml/cex" xmlns:w16cid="http://schemas.microsoft.com/office/word/2016/wordml/cid" xmlns:w16="http://schemas.microsoft.com/office/word/2018/wordml" xmlns:w16sdtdh="http://schemas.microsoft.com/office/word/2020/wordml/sdtdatahash" xmlns:w16se="http://schemas.microsoft.com/office/word/2015/wordml/symex" xmlns:wpg="http://schemas.microsoft.com/office/word/2010/wordprocessingGroup" xmlns:wpi="http://schemas.microsoft.com/office/word/2010/wordprocessingInk" xmlns:wne="http://schemas.microsoft.com/office/word/2006/wordml" xmlns:wps="http://schemas.microsoft.com/office/word/2010/wordprocessingShape" mc:Ignorable="w14 w15 w16se w16cid w16 w16cex w16sdtdh wp14">
   <w:p>
     <w:pPr>
       <w:pStyle w:val="Footer"/>
@@ -2086,7 +2792,7 @@
 </file>
 
 <file path=word/footnotes.xml><?xml version="1.0" encoding="utf-8"?>
-<w:footnotes xmlns:wpc="http://schemas.microsoft.com/office/word/2010/wordprocessingCanvas" xmlns:cx="http://schemas.microsoft.com/office/drawing/2014/chartex" xmlns:cx1="http://schemas.microsoft.com/office/drawing/2015/9/8/chartex" xmlns:cx2="http://schemas.microsoft.com/office/drawing/2015/10/21/chartex" xmlns:cx3="http://schemas.microsoft.com/office/drawing/2016/5/9/chartex" xmlns:cx4="http://schemas.microsoft.com/office/drawing/2016/5/10/chartex" xmlns:cx5="http://schemas.microsoft.com/office/drawing/2016/5/11/chartex" xmlns:cx6="http://schemas.microsoft.com/office/drawing/2016/5/12/chartex" xmlns:cx7="http://schemas.microsoft.com/office/drawing/2016/5/13/chartex" xmlns:cx8="http://schemas.microsoft.com/office/drawing/2016/5/14/chartex" xmlns:mc="http://schemas.openxmlformats.org/markup-compatibility/2006" xmlns:aink="http://schemas.microsoft.com/office/drawing/2016/ink" xmlns:am3d="http://schemas.microsoft.com/office/drawing/2017/model3d" xmlns:o="urn:schemas-microsoft-com:office:office" xmlns:oel="http://schemas.microsoft.com/office/2019/extlst" xmlns:r="http://schemas.openxmlformats.org/officeDocument/2006/relationships" xmlns:m="http://schemas.openxmlformats.org/officeDocument/2006/math" xmlns:v="urn:schemas-microsoft-com:vml" xmlns:wp14="http://schemas.microsoft.com/office/word/2010/wordprocessingDrawing" xmlns:wp="http://schemas.openxmlformats.org/drawingml/2006/wordprocessingDrawing" xmlns:w10="urn:schemas-microsoft-com:office:word" xmlns:w="http://schemas.openxmlformats.org/wordprocessingml/2006/main" xmlns:w14="http://schemas.microsoft.com/office/word/2010/wordml" xmlns:w15="http://schemas.microsoft.com/office/word/2012/wordml" xmlns:w16cex="http://schemas.microsoft.com/office/word/2018/wordml/cex" xmlns:w16cid="http://schemas.microsoft.com/office/word/2016/wordml/cid" xmlns:w16="http://schemas.microsoft.com/office/word/2018/wordml" xmlns:w16du="http://schemas.microsoft.com/office/word/2023/wordml/word16du" xmlns:w16sdtdh="http://schemas.microsoft.com/office/word/2020/wordml/sdtdatahash" xmlns:w16se="http://schemas.microsoft.com/office/word/2015/wordml/symex" xmlns:wpg="http://schemas.microsoft.com/office/word/2010/wordprocessingGroup" xmlns:wpi="http://schemas.microsoft.com/office/word/2010/wordprocessingInk" xmlns:wne="http://schemas.microsoft.com/office/word/2006/wordml" xmlns:wps="http://schemas.microsoft.com/office/word/2010/wordprocessingShape" mc:Ignorable="w14 w15 w16se w16cid w16 w16cex w16sdtdh w16du wp14">
+<w:footnotes xmlns:wpc="http://schemas.microsoft.com/office/word/2010/wordprocessingCanvas" xmlns:cx="http://schemas.microsoft.com/office/drawing/2014/chartex" xmlns:cx1="http://schemas.microsoft.com/office/drawing/2015/9/8/chartex" xmlns:cx2="http://schemas.microsoft.com/office/drawing/2015/10/21/chartex" xmlns:cx3="http://schemas.microsoft.com/office/drawing/2016/5/9/chartex" xmlns:cx4="http://schemas.microsoft.com/office/drawing/2016/5/10/chartex" xmlns:cx5="http://schemas.microsoft.com/office/drawing/2016/5/11/chartex" xmlns:cx6="http://schemas.microsoft.com/office/drawing/2016/5/12/chartex" xmlns:cx7="http://schemas.microsoft.com/office/drawing/2016/5/13/chartex" xmlns:cx8="http://schemas.microsoft.com/office/drawing/2016/5/14/chartex" xmlns:mc="http://schemas.openxmlformats.org/markup-compatibility/2006" xmlns:aink="http://schemas.microsoft.com/office/drawing/2016/ink" xmlns:am3d="http://schemas.microsoft.com/office/drawing/2017/model3d" xmlns:o="urn:schemas-microsoft-com:office:office" xmlns:oel="http://schemas.microsoft.com/office/2019/extlst" xmlns:r="http://schemas.openxmlformats.org/officeDocument/2006/relationships" xmlns:m="http://schemas.openxmlformats.org/officeDocument/2006/math" xmlns:v="urn:schemas-microsoft-com:vml" xmlns:wp14="http://schemas.microsoft.com/office/word/2010/wordprocessingDrawing" xmlns:wp="http://schemas.openxmlformats.org/drawingml/2006/wordprocessingDrawing" xmlns:w10="urn:schemas-microsoft-com:office:word" xmlns:w="http://schemas.openxmlformats.org/wordprocessingml/2006/main" xmlns:w14="http://schemas.microsoft.com/office/word/2010/wordml" xmlns:w15="http://schemas.microsoft.com/office/word/2012/wordml" xmlns:w16cex="http://schemas.microsoft.com/office/word/2018/wordml/cex" xmlns:w16cid="http://schemas.microsoft.com/office/word/2016/wordml/cid" xmlns:w16="http://schemas.microsoft.com/office/word/2018/wordml" xmlns:w16sdtdh="http://schemas.microsoft.com/office/word/2020/wordml/sdtdatahash" xmlns:w16se="http://schemas.microsoft.com/office/word/2015/wordml/symex" xmlns:wpg="http://schemas.microsoft.com/office/word/2010/wordprocessingGroup" xmlns:wpi="http://schemas.microsoft.com/office/word/2010/wordprocessingInk" xmlns:wne="http://schemas.microsoft.com/office/word/2006/wordml" xmlns:wps="http://schemas.microsoft.com/office/word/2010/wordprocessingShape" mc:Ignorable="w14 w15 w16se w16cid w16 w16cex w16sdtdh wp14">
   <w:footnote w:type="separator" w:id="-1">
     <w:p>
       <w:pPr>
@@ -2111,7 +2817,7 @@
 </file>
 
 <file path=word/header1.xml><?xml version="1.0" encoding="utf-8"?>
-<w:hdr xmlns:wpc="http://schemas.microsoft.com/office/word/2010/wordprocessingCanvas" xmlns:cx="http://schemas.microsoft.com/office/drawing/2014/chartex" xmlns:cx1="http://schemas.microsoft.com/office/drawing/2015/9/8/chartex" xmlns:cx2="http://schemas.microsoft.com/office/drawing/2015/10/21/chartex" xmlns:cx3="http://schemas.microsoft.com/office/drawing/2016/5/9/chartex" xmlns:cx4="http://schemas.microsoft.com/office/drawing/2016/5/10/chartex" xmlns:cx5="http://schemas.microsoft.com/office/drawing/2016/5/11/chartex" xmlns:cx6="http://schemas.microsoft.com/office/drawing/2016/5/12/chartex" xmlns:cx7="http://schemas.microsoft.com/office/drawing/2016/5/13/chartex" xmlns:cx8="http://schemas.microsoft.com/office/drawing/2016/5/14/chartex" xmlns:mc="http://schemas.openxmlformats.org/markup-compatibility/2006" xmlns:aink="http://schemas.microsoft.com/office/drawing/2016/ink" xmlns:am3d="http://schemas.microsoft.com/office/drawing/2017/model3d" xmlns:o="urn:schemas-microsoft-com:office:office" xmlns:oel="http://schemas.microsoft.com/office/2019/extlst" xmlns:r="http://schemas.openxmlformats.org/officeDocument/2006/relationships" xmlns:m="http://schemas.openxmlformats.org/officeDocument/2006/math" xmlns:v="urn:schemas-microsoft-com:vml" xmlns:wp14="http://schemas.microsoft.com/office/word/2010/wordprocessingDrawing" xmlns:wp="http://schemas.openxmlformats.org/drawingml/2006/wordprocessingDrawing" xmlns:w10="urn:schemas-microsoft-com:office:word" xmlns:w="http://schemas.openxmlformats.org/wordprocessingml/2006/main" xmlns:w14="http://schemas.microsoft.com/office/word/2010/wordml" xmlns:w15="http://schemas.microsoft.com/office/word/2012/wordml" xmlns:w16cex="http://schemas.microsoft.com/office/word/2018/wordml/cex" xmlns:w16cid="http://schemas.microsoft.com/office/word/2016/wordml/cid" xmlns:w16="http://schemas.microsoft.com/office/word/2018/wordml" xmlns:w16du="http://schemas.microsoft.com/office/word/2023/wordml/word16du" xmlns:w16sdtdh="http://schemas.microsoft.com/office/word/2020/wordml/sdtdatahash" xmlns:w16se="http://schemas.microsoft.com/office/word/2015/wordml/symex" xmlns:wpg="http://schemas.microsoft.com/office/word/2010/wordprocessingGroup" xmlns:wpi="http://schemas.microsoft.com/office/word/2010/wordprocessingInk" xmlns:wne="http://schemas.microsoft.com/office/word/2006/wordml" xmlns:wps="http://schemas.microsoft.com/office/word/2010/wordprocessingShape" mc:Ignorable="w14 w15 w16se w16cid w16 w16cex w16sdtdh w16du wp14">
+<w:hdr xmlns:wpc="http://schemas.microsoft.com/office/word/2010/wordprocessingCanvas" xmlns:cx="http://schemas.microsoft.com/office/drawing/2014/chartex" xmlns:cx1="http://schemas.microsoft.com/office/drawing/2015/9/8/chartex" xmlns:cx2="http://schemas.microsoft.com/office/drawing/2015/10/21/chartex" xmlns:cx3="http://schemas.microsoft.com/office/drawing/2016/5/9/chartex" xmlns:cx4="http://schemas.microsoft.com/office/drawing/2016/5/10/chartex" xmlns:cx5="http://schemas.microsoft.com/office/drawing/2016/5/11/chartex" xmlns:cx6="http://schemas.microsoft.com/office/drawing/2016/5/12/chartex" xmlns:cx7="http://schemas.microsoft.com/office/drawing/2016/5/13/chartex" xmlns:cx8="http://schemas.microsoft.com/office/drawing/2016/5/14/chartex" xmlns:mc="http://schemas.openxmlformats.org/markup-compatibility/2006" xmlns:aink="http://schemas.microsoft.com/office/drawing/2016/ink" xmlns:am3d="http://schemas.microsoft.com/office/drawing/2017/model3d" xmlns:o="urn:schemas-microsoft-com:office:office" xmlns:oel="http://schemas.microsoft.com/office/2019/extlst" xmlns:r="http://schemas.openxmlformats.org/officeDocument/2006/relationships" xmlns:m="http://schemas.openxmlformats.org/officeDocument/2006/math" xmlns:v="urn:schemas-microsoft-com:vml" xmlns:wp14="http://schemas.microsoft.com/office/word/2010/wordprocessingDrawing" xmlns:wp="http://schemas.openxmlformats.org/drawingml/2006/wordprocessingDrawing" xmlns:w10="urn:schemas-microsoft-com:office:word" xmlns:w="http://schemas.openxmlformats.org/wordprocessingml/2006/main" xmlns:w14="http://schemas.microsoft.com/office/word/2010/wordml" xmlns:w15="http://schemas.microsoft.com/office/word/2012/wordml" xmlns:w16cex="http://schemas.microsoft.com/office/word/2018/wordml/cex" xmlns:w16cid="http://schemas.microsoft.com/office/word/2016/wordml/cid" xmlns:w16="http://schemas.microsoft.com/office/word/2018/wordml" xmlns:w16sdtdh="http://schemas.microsoft.com/office/word/2020/wordml/sdtdatahash" xmlns:w16se="http://schemas.microsoft.com/office/word/2015/wordml/symex" xmlns:wpg="http://schemas.microsoft.com/office/word/2010/wordprocessingGroup" xmlns:wpi="http://schemas.microsoft.com/office/word/2010/wordprocessingInk" xmlns:wne="http://schemas.microsoft.com/office/word/2006/wordml" xmlns:wps="http://schemas.microsoft.com/office/word/2010/wordprocessingShape" mc:Ignorable="w14 w15 w16se w16cid w16 w16cex w16sdtdh wp14">
   <w:p>
     <w:pPr>
       <w:pStyle w:val="Header"/>
@@ -2121,7 +2827,7 @@
 </file>
 
 <file path=word/header2.xml><?xml version="1.0" encoding="utf-8"?>
-<w:hdr xmlns:wpc="http://schemas.microsoft.com/office/word/2010/wordprocessingCanvas" xmlns:cx="http://schemas.microsoft.com/office/drawing/2014/chartex" xmlns:cx1="http://schemas.microsoft.com/office/drawing/2015/9/8/chartex" xmlns:cx2="http://schemas.microsoft.com/office/drawing/2015/10/21/chartex" xmlns:cx3="http://schemas.microsoft.com/office/drawing/2016/5/9/chartex" xmlns:cx4="http://schemas.microsoft.com/office/drawing/2016/5/10/chartex" xmlns:cx5="http://schemas.microsoft.com/office/drawing/2016/5/11/chartex" xmlns:cx6="http://schemas.microsoft.com/office/drawing/2016/5/12/chartex" xmlns:cx7="http://schemas.microsoft.com/office/drawing/2016/5/13/chartex" xmlns:cx8="http://schemas.microsoft.com/office/drawing/2016/5/14/chartex" xmlns:mc="http://schemas.openxmlformats.org/markup-compatibility/2006" xmlns:aink="http://schemas.microsoft.com/office/drawing/2016/ink" xmlns:am3d="http://schemas.microsoft.com/office/drawing/2017/model3d" xmlns:o="urn:schemas-microsoft-com:office:office" xmlns:oel="http://schemas.microsoft.com/office/2019/extlst" xmlns:r="http://schemas.openxmlformats.org/officeDocument/2006/relationships" xmlns:m="http://schemas.openxmlformats.org/officeDocument/2006/math" xmlns:v="urn:schemas-microsoft-com:vml" xmlns:wp14="http://schemas.microsoft.com/office/word/2010/wordprocessingDrawing" xmlns:wp="http://schemas.openxmlformats.org/drawingml/2006/wordprocessingDrawing" xmlns:w10="urn:schemas-microsoft-com:office:word" xmlns:w="http://schemas.openxmlformats.org/wordprocessingml/2006/main" xmlns:w14="http://schemas.microsoft.com/office/word/2010/wordml" xmlns:w15="http://schemas.microsoft.com/office/word/2012/wordml" xmlns:w16cex="http://schemas.microsoft.com/office/word/2018/wordml/cex" xmlns:w16cid="http://schemas.microsoft.com/office/word/2016/wordml/cid" xmlns:w16="http://schemas.microsoft.com/office/word/2018/wordml" xmlns:w16du="http://schemas.microsoft.com/office/word/2023/wordml/word16du" xmlns:w16sdtdh="http://schemas.microsoft.com/office/word/2020/wordml/sdtdatahash" xmlns:w16se="http://schemas.microsoft.com/office/word/2015/wordml/symex" xmlns:wpg="http://schemas.microsoft.com/office/word/2010/wordprocessingGroup" xmlns:wpi="http://schemas.microsoft.com/office/word/2010/wordprocessingInk" xmlns:wne="http://schemas.microsoft.com/office/word/2006/wordml" xmlns:wps="http://schemas.microsoft.com/office/word/2010/wordprocessingShape" mc:Ignorable="w14 w15 w16se w16cid w16 w16cex w16sdtdh w16du wp14">
+<w:hdr xmlns:wpc="http://schemas.microsoft.com/office/word/2010/wordprocessingCanvas" xmlns:cx="http://schemas.microsoft.com/office/drawing/2014/chartex" xmlns:cx1="http://schemas.microsoft.com/office/drawing/2015/9/8/chartex" xmlns:cx2="http://schemas.microsoft.com/office/drawing/2015/10/21/chartex" xmlns:cx3="http://schemas.microsoft.com/office/drawing/2016/5/9/chartex" xmlns:cx4="http://schemas.microsoft.com/office/drawing/2016/5/10/chartex" xmlns:cx5="http://schemas.microsoft.com/office/drawing/2016/5/11/chartex" xmlns:cx6="http://schemas.microsoft.com/office/drawing/2016/5/12/chartex" xmlns:cx7="http://schemas.microsoft.com/office/drawing/2016/5/13/chartex" xmlns:cx8="http://schemas.microsoft.com/office/drawing/2016/5/14/chartex" xmlns:mc="http://schemas.openxmlformats.org/markup-compatibility/2006" xmlns:aink="http://schemas.microsoft.com/office/drawing/2016/ink" xmlns:am3d="http://schemas.microsoft.com/office/drawing/2017/model3d" xmlns:o="urn:schemas-microsoft-com:office:office" xmlns:oel="http://schemas.microsoft.com/office/2019/extlst" xmlns:r="http://schemas.openxmlformats.org/officeDocument/2006/relationships" xmlns:m="http://schemas.openxmlformats.org/officeDocument/2006/math" xmlns:v="urn:schemas-microsoft-com:vml" xmlns:wp14="http://schemas.microsoft.com/office/word/2010/wordprocessingDrawing" xmlns:wp="http://schemas.openxmlformats.org/drawingml/2006/wordprocessingDrawing" xmlns:w10="urn:schemas-microsoft-com:office:word" xmlns:w="http://schemas.openxmlformats.org/wordprocessingml/2006/main" xmlns:w14="http://schemas.microsoft.com/office/word/2010/wordml" xmlns:w15="http://schemas.microsoft.com/office/word/2012/wordml" xmlns:w16cex="http://schemas.microsoft.com/office/word/2018/wordml/cex" xmlns:w16cid="http://schemas.microsoft.com/office/word/2016/wordml/cid" xmlns:w16="http://schemas.microsoft.com/office/word/2018/wordml" xmlns:w16sdtdh="http://schemas.microsoft.com/office/word/2020/wordml/sdtdatahash" xmlns:w16se="http://schemas.microsoft.com/office/word/2015/wordml/symex" xmlns:wpg="http://schemas.microsoft.com/office/word/2010/wordprocessingGroup" xmlns:wpi="http://schemas.microsoft.com/office/word/2010/wordprocessingInk" xmlns:wne="http://schemas.microsoft.com/office/word/2006/wordml" xmlns:wps="http://schemas.microsoft.com/office/word/2010/wordprocessingShape" mc:Ignorable="w14 w15 w16se w16cid w16 w16cex w16sdtdh wp14">
   <w:p>
     <w:pPr>
       <w:pStyle w:val="Header"/>
@@ -2131,7 +2837,7 @@
 </file>
 
 <file path=word/header3.xml><?xml version="1.0" encoding="utf-8"?>
-<w:hdr xmlns:wpc="http://schemas.microsoft.com/office/word/2010/wordprocessingCanvas" xmlns:cx="http://schemas.microsoft.com/office/drawing/2014/chartex" xmlns:cx1="http://schemas.microsoft.com/office/drawing/2015/9/8/chartex" xmlns:cx2="http://schemas.microsoft.com/office/drawing/2015/10/21/chartex" xmlns:cx3="http://schemas.microsoft.com/office/drawing/2016/5/9/chartex" xmlns:cx4="http://schemas.microsoft.com/office/drawing/2016/5/10/chartex" xmlns:cx5="http://schemas.microsoft.com/office/drawing/2016/5/11/chartex" xmlns:cx6="http://schemas.microsoft.com/office/drawing/2016/5/12/chartex" xmlns:cx7="http://schemas.microsoft.com/office/drawing/2016/5/13/chartex" xmlns:cx8="http://schemas.microsoft.com/office/drawing/2016/5/14/chartex" xmlns:mc="http://schemas.openxmlformats.org/markup-compatibility/2006" xmlns:aink="http://schemas.microsoft.com/office/drawing/2016/ink" xmlns:am3d="http://schemas.microsoft.com/office/drawing/2017/model3d" xmlns:o="urn:schemas-microsoft-com:office:office" xmlns:oel="http://schemas.microsoft.com/office/2019/extlst" xmlns:r="http://schemas.openxmlformats.org/officeDocument/2006/relationships" xmlns:m="http://schemas.openxmlformats.org/officeDocument/2006/math" xmlns:v="urn:schemas-microsoft-com:vml" xmlns:wp14="http://schemas.microsoft.com/office/word/2010/wordprocessingDrawing" xmlns:wp="http://schemas.openxmlformats.org/drawingml/2006/wordprocessingDrawing" xmlns:w10="urn:schemas-microsoft-com:office:word" xmlns:w="http://schemas.openxmlformats.org/wordprocessingml/2006/main" xmlns:w14="http://schemas.microsoft.com/office/word/2010/wordml" xmlns:w15="http://schemas.microsoft.com/office/word/2012/wordml" xmlns:w16cex="http://schemas.microsoft.com/office/word/2018/wordml/cex" xmlns:w16cid="http://schemas.microsoft.com/office/word/2016/wordml/cid" xmlns:w16="http://schemas.microsoft.com/office/word/2018/wordml" xmlns:w16du="http://schemas.microsoft.com/office/word/2023/wordml/word16du" xmlns:w16sdtdh="http://schemas.microsoft.com/office/word/2020/wordml/sdtdatahash" xmlns:w16se="http://schemas.microsoft.com/office/word/2015/wordml/symex" xmlns:wpg="http://schemas.microsoft.com/office/word/2010/wordprocessingGroup" xmlns:wpi="http://schemas.microsoft.com/office/word/2010/wordprocessingInk" xmlns:wne="http://schemas.microsoft.com/office/word/2006/wordml" xmlns:wps="http://schemas.microsoft.com/office/word/2010/wordprocessingShape" mc:Ignorable="w14 w15 w16se w16cid w16 w16cex w16sdtdh w16du wp14">
+<w:hdr xmlns:wpc="http://schemas.microsoft.com/office/word/2010/wordprocessingCanvas" xmlns:cx="http://schemas.microsoft.com/office/drawing/2014/chartex" xmlns:cx1="http://schemas.microsoft.com/office/drawing/2015/9/8/chartex" xmlns:cx2="http://schemas.microsoft.com/office/drawing/2015/10/21/chartex" xmlns:cx3="http://schemas.microsoft.com/office/drawing/2016/5/9/chartex" xmlns:cx4="http://schemas.microsoft.com/office/drawing/2016/5/10/chartex" xmlns:cx5="http://schemas.microsoft.com/office/drawing/2016/5/11/chartex" xmlns:cx6="http://schemas.microsoft.com/office/drawing/2016/5/12/chartex" xmlns:cx7="http://schemas.microsoft.com/office/drawing/2016/5/13/chartex" xmlns:cx8="http://schemas.microsoft.com/office/drawing/2016/5/14/chartex" xmlns:mc="http://schemas.openxmlformats.org/markup-compatibility/2006" xmlns:aink="http://schemas.microsoft.com/office/drawing/2016/ink" xmlns:am3d="http://schemas.microsoft.com/office/drawing/2017/model3d" xmlns:o="urn:schemas-microsoft-com:office:office" xmlns:oel="http://schemas.microsoft.com/office/2019/extlst" xmlns:r="http://schemas.openxmlformats.org/officeDocument/2006/relationships" xmlns:m="http://schemas.openxmlformats.org/officeDocument/2006/math" xmlns:v="urn:schemas-microsoft-com:vml" xmlns:wp14="http://schemas.microsoft.com/office/word/2010/wordprocessingDrawing" xmlns:wp="http://schemas.openxmlformats.org/drawingml/2006/wordprocessingDrawing" xmlns:w10="urn:schemas-microsoft-com:office:word" xmlns:w="http://schemas.openxmlformats.org/wordprocessingml/2006/main" xmlns:w14="http://schemas.microsoft.com/office/word/2010/wordml" xmlns:w15="http://schemas.microsoft.com/office/word/2012/wordml" xmlns:w16cex="http://schemas.microsoft.com/office/word/2018/wordml/cex" xmlns:w16cid="http://schemas.microsoft.com/office/word/2016/wordml/cid" xmlns:w16="http://schemas.microsoft.com/office/word/2018/wordml" xmlns:w16sdtdh="http://schemas.microsoft.com/office/word/2020/wordml/sdtdatahash" xmlns:w16se="http://schemas.microsoft.com/office/word/2015/wordml/symex" xmlns:wpg="http://schemas.microsoft.com/office/word/2010/wordprocessingGroup" xmlns:wpi="http://schemas.microsoft.com/office/word/2010/wordprocessingInk" xmlns:wne="http://schemas.microsoft.com/office/word/2006/wordml" xmlns:wps="http://schemas.microsoft.com/office/word/2010/wordprocessingShape" mc:Ignorable="w14 w15 w16se w16cid w16 w16cex w16sdtdh wp14">
   <w:p>
     <w:pPr>
       <w:pStyle w:val="Header"/>
@@ -2141,8 +2847,94 @@
 </file>
 
 <file path=word/numbering.xml><?xml version="1.0" encoding="utf-8"?>
-<w:numbering xmlns:wpc="http://schemas.microsoft.com/office/word/2010/wordprocessingCanvas" xmlns:cx="http://schemas.microsoft.com/office/drawing/2014/chartex" xmlns:cx1="http://schemas.microsoft.com/office/drawing/2015/9/8/chartex" xmlns:cx2="http://schemas.microsoft.com/office/drawing/2015/10/21/chartex" xmlns:cx3="http://schemas.microsoft.com/office/drawing/2016/5/9/chartex" xmlns:cx4="http://schemas.microsoft.com/office/drawing/2016/5/10/chartex" xmlns:cx5="http://schemas.microsoft.com/office/drawing/2016/5/11/chartex" xmlns:cx6="http://schemas.microsoft.com/office/drawing/2016/5/12/chartex" xmlns:cx7="http://schemas.microsoft.com/office/drawing/2016/5/13/chartex" xmlns:cx8="http://schemas.microsoft.com/office/drawing/2016/5/14/chartex" xmlns:mc="http://schemas.openxmlformats.org/markup-compatibility/2006" xmlns:aink="http://schemas.microsoft.com/office/drawing/2016/ink" xmlns:am3d="http://schemas.microsoft.com/office/drawing/2017/model3d" xmlns:o="urn:schemas-microsoft-com:office:office" xmlns:oel="http://schemas.microsoft.com/office/2019/extlst" xmlns:r="http://schemas.openxmlformats.org/officeDocument/2006/relationships" xmlns:m="http://schemas.openxmlformats.org/officeDocument/2006/math" xmlns:v="urn:schemas-microsoft-com:vml" xmlns:wp14="http://schemas.microsoft.com/office/word/2010/wordprocessingDrawing" xmlns:wp="http://schemas.openxmlformats.org/drawingml/2006/wordprocessingDrawing" xmlns:w10="urn:schemas-microsoft-com:office:word" xmlns:w="http://schemas.openxmlformats.org/wordprocessingml/2006/main" xmlns:w14="http://schemas.microsoft.com/office/word/2010/wordml" xmlns:w15="http://schemas.microsoft.com/office/word/2012/wordml" xmlns:w16cex="http://schemas.microsoft.com/office/word/2018/wordml/cex" xmlns:w16cid="http://schemas.microsoft.com/office/word/2016/wordml/cid" xmlns:w16="http://schemas.microsoft.com/office/word/2018/wordml" xmlns:w16du="http://schemas.microsoft.com/office/word/2023/wordml/word16du" xmlns:w16sdtdh="http://schemas.microsoft.com/office/word/2020/wordml/sdtdatahash" xmlns:w16se="http://schemas.microsoft.com/office/word/2015/wordml/symex" xmlns:wpg="http://schemas.microsoft.com/office/word/2010/wordprocessingGroup" xmlns:wpi="http://schemas.microsoft.com/office/word/2010/wordprocessingInk" xmlns:wne="http://schemas.microsoft.com/office/word/2006/wordml" xmlns:wps="http://schemas.microsoft.com/office/word/2010/wordprocessingShape" mc:Ignorable="w14 w15 w16se w16cid w16 w16cex w16sdtdh w16du wp14">
+<w:numbering xmlns:wpc="http://schemas.microsoft.com/office/word/2010/wordprocessingCanvas" xmlns:cx="http://schemas.microsoft.com/office/drawing/2014/chartex" xmlns:cx1="http://schemas.microsoft.com/office/drawing/2015/9/8/chartex" xmlns:cx2="http://schemas.microsoft.com/office/drawing/2015/10/21/chartex" xmlns:cx3="http://schemas.microsoft.com/office/drawing/2016/5/9/chartex" xmlns:cx4="http://schemas.microsoft.com/office/drawing/2016/5/10/chartex" xmlns:cx5="http://schemas.microsoft.com/office/drawing/2016/5/11/chartex" xmlns:cx6="http://schemas.microsoft.com/office/drawing/2016/5/12/chartex" xmlns:cx7="http://schemas.microsoft.com/office/drawing/2016/5/13/chartex" xmlns:cx8="http://schemas.microsoft.com/office/drawing/2016/5/14/chartex" xmlns:mc="http://schemas.openxmlformats.org/markup-compatibility/2006" xmlns:aink="http://schemas.microsoft.com/office/drawing/2016/ink" xmlns:am3d="http://schemas.microsoft.com/office/drawing/2017/model3d" xmlns:o="urn:schemas-microsoft-com:office:office" xmlns:oel="http://schemas.microsoft.com/office/2019/extlst" xmlns:r="http://schemas.openxmlformats.org/officeDocument/2006/relationships" xmlns:m="http://schemas.openxmlformats.org/officeDocument/2006/math" xmlns:v="urn:schemas-microsoft-com:vml" xmlns:wp14="http://schemas.microsoft.com/office/word/2010/wordprocessingDrawing" xmlns:wp="http://schemas.openxmlformats.org/drawingml/2006/wordprocessingDrawing" xmlns:w10="urn:schemas-microsoft-com:office:word" xmlns:w="http://schemas.openxmlformats.org/wordprocessingml/2006/main" xmlns:w14="http://schemas.microsoft.com/office/word/2010/wordml" xmlns:w15="http://schemas.microsoft.com/office/word/2012/wordml" xmlns:w16cex="http://schemas.microsoft.com/office/word/2018/wordml/cex" xmlns:w16cid="http://schemas.microsoft.com/office/word/2016/wordml/cid" xmlns:w16="http://schemas.microsoft.com/office/word/2018/wordml" xmlns:w16sdtdh="http://schemas.microsoft.com/office/word/2020/wordml/sdtdatahash" xmlns:w16se="http://schemas.microsoft.com/office/word/2015/wordml/symex" xmlns:wpg="http://schemas.microsoft.com/office/word/2010/wordprocessingGroup" xmlns:wpi="http://schemas.microsoft.com/office/word/2010/wordprocessingInk" xmlns:wne="http://schemas.microsoft.com/office/word/2006/wordml" xmlns:wps="http://schemas.microsoft.com/office/word/2010/wordprocessingShape" mc:Ignorable="w14 w15 w16se w16cid w16 w16cex w16sdtdh wp14">
   <w:abstractNum w:abstractNumId="0" w15:restartNumberingAfterBreak="0">
+    <w:nsid w:val="238317CC"/>
+    <w:multiLevelType w:val="hybridMultilevel"/>
+    <w:tmpl w:val="B57AB8DC"/>
+    <w:lvl w:ilvl="0" w:tplc="0809000F">
+      <w:start w:val="1"/>
+      <w:numFmt w:val="decimal"/>
+      <w:lvlText w:val="%1."/>
+      <w:lvlJc w:val="left"/>
+      <w:pPr>
+        <w:ind w:left="720" w:hanging="360"/>
+      </w:pPr>
+    </w:lvl>
+    <w:lvl w:ilvl="1" w:tplc="08090019">
+      <w:start w:val="1"/>
+      <w:numFmt w:val="lowerLetter"/>
+      <w:lvlText w:val="%2."/>
+      <w:lvlJc w:val="left"/>
+      <w:pPr>
+        <w:ind w:left="1440" w:hanging="360"/>
+      </w:pPr>
+    </w:lvl>
+    <w:lvl w:ilvl="2" w:tplc="0809001B">
+      <w:start w:val="1"/>
+      <w:numFmt w:val="lowerRoman"/>
+      <w:lvlText w:val="%3."/>
+      <w:lvlJc w:val="right"/>
+      <w:pPr>
+        <w:ind w:left="2160" w:hanging="180"/>
+      </w:pPr>
+    </w:lvl>
+    <w:lvl w:ilvl="3" w:tplc="0809000F">
+      <w:start w:val="1"/>
+      <w:numFmt w:val="decimal"/>
+      <w:lvlText w:val="%4."/>
+      <w:lvlJc w:val="left"/>
+      <w:pPr>
+        <w:ind w:left="2880" w:hanging="360"/>
+      </w:pPr>
+    </w:lvl>
+    <w:lvl w:ilvl="4" w:tplc="08090019">
+      <w:start w:val="1"/>
+      <w:numFmt w:val="lowerLetter"/>
+      <w:lvlText w:val="%5."/>
+      <w:lvlJc w:val="left"/>
+      <w:pPr>
+        <w:ind w:left="3600" w:hanging="360"/>
+      </w:pPr>
+    </w:lvl>
+    <w:lvl w:ilvl="5" w:tplc="0809001B">
+      <w:start w:val="1"/>
+      <w:numFmt w:val="lowerRoman"/>
+      <w:lvlText w:val="%6."/>
+      <w:lvlJc w:val="right"/>
+      <w:pPr>
+        <w:ind w:left="4320" w:hanging="180"/>
+      </w:pPr>
+    </w:lvl>
+    <w:lvl w:ilvl="6" w:tplc="0809000F">
+      <w:start w:val="1"/>
+      <w:numFmt w:val="decimal"/>
+      <w:lvlText w:val="%7."/>
+      <w:lvlJc w:val="left"/>
+      <w:pPr>
+        <w:ind w:left="5040" w:hanging="360"/>
+      </w:pPr>
+    </w:lvl>
+    <w:lvl w:ilvl="7" w:tplc="08090019">
+      <w:start w:val="1"/>
+      <w:numFmt w:val="lowerLetter"/>
+      <w:lvlText w:val="%8."/>
+      <w:lvlJc w:val="left"/>
+      <w:pPr>
+        <w:ind w:left="5760" w:hanging="360"/>
+      </w:pPr>
+    </w:lvl>
+    <w:lvl w:ilvl="8" w:tplc="0809001B">
+      <w:start w:val="1"/>
+      <w:numFmt w:val="lowerRoman"/>
+      <w:lvlText w:val="%9."/>
+      <w:lvlJc w:val="right"/>
+      <w:pPr>
+        <w:ind w:left="6480" w:hanging="180"/>
+      </w:pPr>
+    </w:lvl>
+  </w:abstractNum>
+  <w:abstractNum w:abstractNumId="1" w15:restartNumberingAfterBreak="0">
     <w:nsid w:val="35647A52"/>
     <w:multiLevelType w:val="hybridMultilevel"/>
     <w:tmpl w:val="E8B284B0"/>
@@ -2255,10 +3047,10 @@
       </w:pPr>
     </w:lvl>
   </w:abstractNum>
-  <w:abstractNum w:abstractNumId="1" w15:restartNumberingAfterBreak="0">
+  <w:abstractNum w:abstractNumId="2" w15:restartNumberingAfterBreak="0">
     <w:nsid w:val="45982DE4"/>
     <w:multiLevelType w:val="hybridMultilevel"/>
-    <w:tmpl w:val="3B7C633A"/>
+    <w:tmpl w:val="B086B908"/>
     <w:lvl w:ilvl="0" w:tplc="01B4BF58">
       <w:start w:val="1"/>
       <w:numFmt w:val="decimal"/>
@@ -2344,7 +3136,93 @@
       </w:pPr>
     </w:lvl>
   </w:abstractNum>
-  <w:abstractNum w:abstractNumId="2" w15:restartNumberingAfterBreak="0">
+  <w:abstractNum w:abstractNumId="3" w15:restartNumberingAfterBreak="0">
+    <w:nsid w:val="4A4E67EC"/>
+    <w:multiLevelType w:val="hybridMultilevel"/>
+    <w:tmpl w:val="822E8F30"/>
+    <w:lvl w:ilvl="0" w:tplc="FFFFFFFF">
+      <w:start w:val="1"/>
+      <w:numFmt w:val="decimal"/>
+      <w:lvlText w:val="%1."/>
+      <w:lvlJc w:val="left"/>
+      <w:pPr>
+        <w:ind w:left="720" w:hanging="360"/>
+      </w:pPr>
+    </w:lvl>
+    <w:lvl w:ilvl="1" w:tplc="FFFFFFFF">
+      <w:start w:val="1"/>
+      <w:numFmt w:val="lowerLetter"/>
+      <w:lvlText w:val="%2."/>
+      <w:lvlJc w:val="left"/>
+      <w:pPr>
+        <w:ind w:left="1440" w:hanging="360"/>
+      </w:pPr>
+    </w:lvl>
+    <w:lvl w:ilvl="2" w:tplc="FFFFFFFF">
+      <w:start w:val="1"/>
+      <w:numFmt w:val="lowerRoman"/>
+      <w:lvlText w:val="%3."/>
+      <w:lvlJc w:val="right"/>
+      <w:pPr>
+        <w:ind w:left="2160" w:hanging="180"/>
+      </w:pPr>
+    </w:lvl>
+    <w:lvl w:ilvl="3" w:tplc="FFFFFFFF">
+      <w:start w:val="1"/>
+      <w:numFmt w:val="decimal"/>
+      <w:lvlText w:val="%4."/>
+      <w:lvlJc w:val="left"/>
+      <w:pPr>
+        <w:ind w:left="2880" w:hanging="360"/>
+      </w:pPr>
+    </w:lvl>
+    <w:lvl w:ilvl="4" w:tplc="FFFFFFFF">
+      <w:start w:val="1"/>
+      <w:numFmt w:val="lowerLetter"/>
+      <w:lvlText w:val="%5."/>
+      <w:lvlJc w:val="left"/>
+      <w:pPr>
+        <w:ind w:left="3600" w:hanging="360"/>
+      </w:pPr>
+    </w:lvl>
+    <w:lvl w:ilvl="5" w:tplc="FFFFFFFF">
+      <w:start w:val="1"/>
+      <w:numFmt w:val="lowerRoman"/>
+      <w:lvlText w:val="%6."/>
+      <w:lvlJc w:val="right"/>
+      <w:pPr>
+        <w:ind w:left="4320" w:hanging="180"/>
+      </w:pPr>
+    </w:lvl>
+    <w:lvl w:ilvl="6" w:tplc="FFFFFFFF">
+      <w:start w:val="1"/>
+      <w:numFmt w:val="decimal"/>
+      <w:lvlText w:val="%7."/>
+      <w:lvlJc w:val="left"/>
+      <w:pPr>
+        <w:ind w:left="5040" w:hanging="360"/>
+      </w:pPr>
+    </w:lvl>
+    <w:lvl w:ilvl="7" w:tplc="FFFFFFFF">
+      <w:start w:val="1"/>
+      <w:numFmt w:val="lowerLetter"/>
+      <w:lvlText w:val="%8."/>
+      <w:lvlJc w:val="left"/>
+      <w:pPr>
+        <w:ind w:left="5760" w:hanging="360"/>
+      </w:pPr>
+    </w:lvl>
+    <w:lvl w:ilvl="8" w:tplc="FFFFFFFF">
+      <w:start w:val="1"/>
+      <w:numFmt w:val="lowerRoman"/>
+      <w:lvlText w:val="%9."/>
+      <w:lvlJc w:val="right"/>
+      <w:pPr>
+        <w:ind w:left="6480" w:hanging="180"/>
+      </w:pPr>
+    </w:lvl>
+  </w:abstractNum>
+  <w:abstractNum w:abstractNumId="4" w15:restartNumberingAfterBreak="0">
     <w:nsid w:val="57906DE1"/>
     <w:multiLevelType w:val="hybridMultilevel"/>
     <w:tmpl w:val="629C72D0"/>
@@ -2458,6 +3336,99 @@
     </w:lvl>
   </w:abstractNum>
   <w:num w:numId="1" w16cid:durableId="612709201">
+    <w:abstractNumId w:val="1"/>
+    <w:lvlOverride w:ilvl="0">
+      <w:startOverride w:val="1"/>
+    </w:lvlOverride>
+    <w:lvlOverride w:ilvl="1">
+      <w:startOverride w:val="1"/>
+    </w:lvlOverride>
+    <w:lvlOverride w:ilvl="2">
+      <w:startOverride w:val="1"/>
+    </w:lvlOverride>
+    <w:lvlOverride w:ilvl="3">
+      <w:startOverride w:val="1"/>
+    </w:lvlOverride>
+    <w:lvlOverride w:ilvl="4">
+      <w:startOverride w:val="1"/>
+    </w:lvlOverride>
+    <w:lvlOverride w:ilvl="5">
+      <w:startOverride w:val="1"/>
+    </w:lvlOverride>
+    <w:lvlOverride w:ilvl="6">
+      <w:startOverride w:val="1"/>
+    </w:lvlOverride>
+    <w:lvlOverride w:ilvl="7">
+      <w:startOverride w:val="1"/>
+    </w:lvlOverride>
+    <w:lvlOverride w:ilvl="8">
+      <w:startOverride w:val="1"/>
+    </w:lvlOverride>
+  </w:num>
+  <w:num w:numId="2" w16cid:durableId="622541421">
+    <w:abstractNumId w:val="4"/>
+    <w:lvlOverride w:ilvl="0">
+      <w:startOverride w:val="1"/>
+    </w:lvlOverride>
+    <w:lvlOverride w:ilvl="1">
+      <w:startOverride w:val="1"/>
+    </w:lvlOverride>
+    <w:lvlOverride w:ilvl="2">
+      <w:startOverride w:val="1"/>
+    </w:lvlOverride>
+    <w:lvlOverride w:ilvl="3">
+      <w:startOverride w:val="1"/>
+    </w:lvlOverride>
+    <w:lvlOverride w:ilvl="4">
+      <w:startOverride w:val="1"/>
+    </w:lvlOverride>
+    <w:lvlOverride w:ilvl="5">
+      <w:startOverride w:val="1"/>
+    </w:lvlOverride>
+    <w:lvlOverride w:ilvl="6">
+      <w:startOverride w:val="1"/>
+    </w:lvlOverride>
+    <w:lvlOverride w:ilvl="7">
+      <w:startOverride w:val="1"/>
+    </w:lvlOverride>
+    <w:lvlOverride w:ilvl="8">
+      <w:startOverride w:val="1"/>
+    </w:lvlOverride>
+  </w:num>
+  <w:num w:numId="3" w16cid:durableId="1596285834">
+    <w:abstractNumId w:val="2"/>
+  </w:num>
+  <w:num w:numId="4" w16cid:durableId="840003456">
+    <w:abstractNumId w:val="3"/>
+    <w:lvlOverride w:ilvl="0">
+      <w:startOverride w:val="1"/>
+    </w:lvlOverride>
+    <w:lvlOverride w:ilvl="1">
+      <w:startOverride w:val="1"/>
+    </w:lvlOverride>
+    <w:lvlOverride w:ilvl="2">
+      <w:startOverride w:val="1"/>
+    </w:lvlOverride>
+    <w:lvlOverride w:ilvl="3">
+      <w:startOverride w:val="1"/>
+    </w:lvlOverride>
+    <w:lvlOverride w:ilvl="4">
+      <w:startOverride w:val="1"/>
+    </w:lvlOverride>
+    <w:lvlOverride w:ilvl="5">
+      <w:startOverride w:val="1"/>
+    </w:lvlOverride>
+    <w:lvlOverride w:ilvl="6">
+      <w:startOverride w:val="1"/>
+    </w:lvlOverride>
+    <w:lvlOverride w:ilvl="7">
+      <w:startOverride w:val="1"/>
+    </w:lvlOverride>
+    <w:lvlOverride w:ilvl="8">
+      <w:startOverride w:val="1"/>
+    </w:lvlOverride>
+  </w:num>
+  <w:num w:numId="5" w16cid:durableId="749884254">
     <w:abstractNumId w:val="0"/>
     <w:lvlOverride w:ilvl="0">
       <w:startOverride w:val="1"/>
@@ -2487,44 +3458,17 @@
       <w:startOverride w:val="1"/>
     </w:lvlOverride>
   </w:num>
-  <w:num w:numId="2" w16cid:durableId="622541421">
-    <w:abstractNumId w:val="2"/>
-    <w:lvlOverride w:ilvl="0">
-      <w:startOverride w:val="1"/>
-    </w:lvlOverride>
-    <w:lvlOverride w:ilvl="1">
-      <w:startOverride w:val="1"/>
-    </w:lvlOverride>
-    <w:lvlOverride w:ilvl="2">
-      <w:startOverride w:val="1"/>
-    </w:lvlOverride>
-    <w:lvlOverride w:ilvl="3">
-      <w:startOverride w:val="1"/>
-    </w:lvlOverride>
-    <w:lvlOverride w:ilvl="4">
-      <w:startOverride w:val="1"/>
-    </w:lvlOverride>
-    <w:lvlOverride w:ilvl="5">
-      <w:startOverride w:val="1"/>
-    </w:lvlOverride>
-    <w:lvlOverride w:ilvl="6">
-      <w:startOverride w:val="1"/>
-    </w:lvlOverride>
-    <w:lvlOverride w:ilvl="7">
-      <w:startOverride w:val="1"/>
-    </w:lvlOverride>
-    <w:lvlOverride w:ilvl="8">
-      <w:startOverride w:val="1"/>
-    </w:lvlOverride>
+  <w:num w:numId="6" w16cid:durableId="27267882">
+    <w:abstractNumId w:val="0"/>
   </w:num>
-  <w:num w:numId="3" w16cid:durableId="1596285834">
+  <w:num w:numId="7" w16cid:durableId="1715884049">
     <w:abstractNumId w:val="1"/>
   </w:num>
 </w:numbering>
 </file>
 
 <file path=word/styles.xml><?xml version="1.0" encoding="utf-8"?>
-<w:styles xmlns:mc="http://schemas.openxmlformats.org/markup-compatibility/2006" xmlns:r="http://schemas.openxmlformats.org/officeDocument/2006/relationships" xmlns:w="http://schemas.openxmlformats.org/wordprocessingml/2006/main" xmlns:w14="http://schemas.microsoft.com/office/word/2010/wordml" xmlns:w15="http://schemas.microsoft.com/office/word/2012/wordml" xmlns:w16cex="http://schemas.microsoft.com/office/word/2018/wordml/cex" xmlns:w16cid="http://schemas.microsoft.com/office/word/2016/wordml/cid" xmlns:w16="http://schemas.microsoft.com/office/word/2018/wordml" xmlns:w16du="http://schemas.microsoft.com/office/word/2023/wordml/word16du" xmlns:w16sdtdh="http://schemas.microsoft.com/office/word/2020/wordml/sdtdatahash" xmlns:w16se="http://schemas.microsoft.com/office/word/2015/wordml/symex" mc:Ignorable="w14 w15 w16se w16cid w16 w16cex w16sdtdh w16du">
+<w:styles xmlns:mc="http://schemas.openxmlformats.org/markup-compatibility/2006" xmlns:r="http://schemas.openxmlformats.org/officeDocument/2006/relationships" xmlns:w="http://schemas.openxmlformats.org/wordprocessingml/2006/main" xmlns:w14="http://schemas.microsoft.com/office/word/2010/wordml" xmlns:w15="http://schemas.microsoft.com/office/word/2012/wordml" xmlns:w16cex="http://schemas.microsoft.com/office/word/2018/wordml/cex" xmlns:w16cid="http://schemas.microsoft.com/office/word/2016/wordml/cid" xmlns:w16="http://schemas.microsoft.com/office/word/2018/wordml" xmlns:w16sdtdh="http://schemas.microsoft.com/office/word/2020/wordml/sdtdatahash" xmlns:w16se="http://schemas.microsoft.com/office/word/2015/wordml/symex" mc:Ignorable="w14 w15 w16se w16cid w16 w16cex w16sdtdh">
   <w:docDefaults>
     <w:rPrDefault>
       <w:rPr>
@@ -3126,7 +4070,6 @@
   <w:style w:type="character" w:default="1" w:styleId="DefaultParagraphFont">
     <w:name w:val="Default Paragraph Font"/>
     <w:uiPriority w:val="1"/>
-    <w:semiHidden/>
     <w:unhideWhenUsed/>
   </w:style>
   <w:style w:type="table" w:default="1" w:styleId="TableNormal">

</xml_diff>

<commit_message>
Additional updates for MINTI Order templates
</commit_message>
<xml_diff>
--- a/docker/docmosis/templates/CV-UNS-DEC-ENG-01287.docx
+++ b/docker/docmosis/templates/CV-UNS-DEC-ENG-01287.docx
@@ -123,7 +123,57 @@
               <w:rPr>
                 <w:rFonts w:ascii="Arial" w:hAnsi="Arial" w:cs="Arial"/>
               </w:rPr>
-              <w:t>&lt;&lt;{dateFormat($nowUTC ,‘d MMMM yyyy’)} &gt;&gt;</w:t>
+              <w:t>&lt;</w:t>
+            </w:r>
+            <w:proofErr w:type="gramStart"/>
+            <w:r>
+              <w:rPr>
+                <w:rFonts w:ascii="Arial" w:hAnsi="Arial" w:cs="Arial"/>
+              </w:rPr>
+              <w:t>&lt;{</w:t>
+            </w:r>
+            <w:proofErr w:type="spellStart"/>
+            <w:proofErr w:type="gramEnd"/>
+            <w:r>
+              <w:rPr>
+                <w:rFonts w:ascii="Arial" w:hAnsi="Arial" w:cs="Arial"/>
+              </w:rPr>
+              <w:t>dateFormat</w:t>
+            </w:r>
+            <w:proofErr w:type="spellEnd"/>
+            <w:r>
+              <w:rPr>
+                <w:rFonts w:ascii="Arial" w:hAnsi="Arial" w:cs="Arial"/>
+              </w:rPr>
+              <w:t>($</w:t>
+            </w:r>
+            <w:proofErr w:type="spellStart"/>
+            <w:r>
+              <w:rPr>
+                <w:rFonts w:ascii="Arial" w:hAnsi="Arial" w:cs="Arial"/>
+              </w:rPr>
+              <w:t>nowUTC</w:t>
+            </w:r>
+            <w:proofErr w:type="spellEnd"/>
+            <w:r>
+              <w:rPr>
+                <w:rFonts w:ascii="Arial" w:hAnsi="Arial" w:cs="Arial"/>
+              </w:rPr>
+              <w:t xml:space="preserve"> ,‘d MMMM </w:t>
+            </w:r>
+            <w:proofErr w:type="spellStart"/>
+            <w:r>
+              <w:rPr>
+                <w:rFonts w:ascii="Arial" w:hAnsi="Arial" w:cs="Arial"/>
+              </w:rPr>
+              <w:t>yyyy</w:t>
+            </w:r>
+            <w:proofErr w:type="spellEnd"/>
+            <w:r>
+              <w:rPr>
+                <w:rFonts w:ascii="Arial" w:hAnsi="Arial" w:cs="Arial"/>
+              </w:rPr>
+              <w:t>’)} &gt;&gt;</w:t>
             </w:r>
           </w:p>
         </w:tc>
@@ -152,8 +202,9 @@
                 <w:sz w:val="28"/>
                 <w:szCs w:val="28"/>
               </w:rPr>
-              <w:t>&lt;&lt;c</w:t>
-            </w:r>
+              <w:t>&lt;&lt;</w:t>
+            </w:r>
+            <w:proofErr w:type="spellStart"/>
             <w:r>
               <w:rPr>
                 <w:rFonts w:ascii="Arial" w:hAnsi="Arial" w:cs="Arial"/>
@@ -162,8 +213,19 @@
                 <w:sz w:val="28"/>
                 <w:szCs w:val="28"/>
               </w:rPr>
+              <w:t>c</w:t>
+            </w:r>
+            <w:r>
+              <w:rPr>
+                <w:rFonts w:ascii="Arial" w:hAnsi="Arial" w:cs="Arial"/>
+                <w:b/>
+                <w:bCs/>
+                <w:sz w:val="28"/>
+                <w:szCs w:val="28"/>
+              </w:rPr>
               <w:t>ourtName</w:t>
             </w:r>
+            <w:proofErr w:type="spellEnd"/>
             <w:r>
               <w:rPr>
                 <w:rFonts w:ascii="Arial" w:hAnsi="Arial" w:cs="Arial"/>
@@ -199,6 +261,7 @@
               </w:rPr>
               <w:t>&lt;&lt;</w:t>
             </w:r>
+            <w:proofErr w:type="spellStart"/>
             <w:r>
               <w:rPr>
                 <w:rFonts w:ascii="Arial" w:hAnsi="Arial" w:cs="Arial"/>
@@ -217,6 +280,7 @@
               </w:rPr>
               <w:t>umber</w:t>
             </w:r>
+            <w:proofErr w:type="spellEnd"/>
             <w:r>
               <w:rPr>
                 <w:rFonts w:ascii="Arial" w:hAnsi="Arial" w:cs="Arial"/>
@@ -322,7 +386,21 @@
               <w:rPr>
                 <w:rFonts w:ascii="Arial" w:hAnsi="Arial" w:cs="Arial"/>
               </w:rPr>
-              <w:t>&lt;&lt;judgeNameTitle&gt;&gt;</w:t>
+              <w:t>&lt;&lt;</w:t>
+            </w:r>
+            <w:proofErr w:type="spellStart"/>
+            <w:r>
+              <w:rPr>
+                <w:rFonts w:ascii="Arial" w:hAnsi="Arial" w:cs="Arial"/>
+              </w:rPr>
+              <w:t>judgeNameTitle</w:t>
+            </w:r>
+            <w:proofErr w:type="spellEnd"/>
+            <w:r>
+              <w:rPr>
+                <w:rFonts w:ascii="Arial" w:hAnsi="Arial" w:cs="Arial"/>
+              </w:rPr>
+              <w:t>&gt;&gt;</w:t>
             </w:r>
           </w:p>
         </w:tc>
@@ -551,13 +629,43 @@
                 <w:rFonts w:ascii="Arial" w:hAnsi="Arial" w:cs="Arial"/>
                 <w:color w:val="0A0A0A"/>
               </w:rPr>
-              <w:t>&lt;&lt;cr_{</w:t>
-            </w:r>
-            <w:r>
-              <w:rPr>
-                <w:rFonts w:ascii="Arial" w:hAnsi="Arial" w:cs="Arial"/>
-              </w:rPr>
-              <w:t>claimant2Name!=null}</w:t>
+              <w:t>&lt;&lt;</w:t>
+            </w:r>
+            <w:proofErr w:type="spellStart"/>
+            <w:r>
+              <w:rPr>
+                <w:rFonts w:ascii="Arial" w:hAnsi="Arial" w:cs="Arial"/>
+                <w:color w:val="0A0A0A"/>
+              </w:rPr>
+              <w:t>cr</w:t>
+            </w:r>
+            <w:proofErr w:type="spellEnd"/>
+            <w:r>
+              <w:rPr>
+                <w:rFonts w:ascii="Arial" w:hAnsi="Arial" w:cs="Arial"/>
+                <w:color w:val="0A0A0A"/>
+              </w:rPr>
+              <w:t>_{</w:t>
+            </w:r>
+            <w:r>
+              <w:rPr>
+                <w:rFonts w:ascii="Arial" w:hAnsi="Arial" w:cs="Arial"/>
+              </w:rPr>
+              <w:t>claimant2</w:t>
+            </w:r>
+            <w:proofErr w:type="gramStart"/>
+            <w:r>
+              <w:rPr>
+                <w:rFonts w:ascii="Arial" w:hAnsi="Arial" w:cs="Arial"/>
+              </w:rPr>
+              <w:t>Name!=</w:t>
+            </w:r>
+            <w:proofErr w:type="gramEnd"/>
+            <w:r>
+              <w:rPr>
+                <w:rFonts w:ascii="Arial" w:hAnsi="Arial" w:cs="Arial"/>
+              </w:rPr>
+              <w:t>null}</w:t>
             </w:r>
             <w:r>
               <w:rPr>
@@ -812,7 +920,21 @@
               <w:rPr>
                 <w:rFonts w:ascii="Arial" w:hAnsi="Arial" w:cs="Arial"/>
               </w:rPr>
-              <w:t>&lt;&lt;defendantNum&gt;&gt;</w:t>
+              <w:t>&lt;&lt;</w:t>
+            </w:r>
+            <w:proofErr w:type="spellStart"/>
+            <w:r>
+              <w:rPr>
+                <w:rFonts w:ascii="Arial" w:hAnsi="Arial" w:cs="Arial"/>
+              </w:rPr>
+              <w:t>defendantNum</w:t>
+            </w:r>
+            <w:proofErr w:type="spellEnd"/>
+            <w:r>
+              <w:rPr>
+                <w:rFonts w:ascii="Arial" w:hAnsi="Arial" w:cs="Arial"/>
+              </w:rPr>
+              <w:t>&gt;&gt;</w:t>
             </w:r>
           </w:p>
         </w:tc>
@@ -839,13 +961,43 @@
                 <w:rFonts w:ascii="Arial" w:hAnsi="Arial" w:cs="Arial"/>
                 <w:color w:val="0A0A0A"/>
               </w:rPr>
-              <w:t>&lt;&lt;cr_{</w:t>
-            </w:r>
-            <w:r>
-              <w:rPr>
-                <w:rFonts w:ascii="Arial" w:hAnsi="Arial" w:cs="Arial"/>
-              </w:rPr>
-              <w:t>defendant2Name!=null}</w:t>
+              <w:t>&lt;&lt;</w:t>
+            </w:r>
+            <w:proofErr w:type="spellStart"/>
+            <w:r>
+              <w:rPr>
+                <w:rFonts w:ascii="Arial" w:hAnsi="Arial" w:cs="Arial"/>
+                <w:color w:val="0A0A0A"/>
+              </w:rPr>
+              <w:t>cr</w:t>
+            </w:r>
+            <w:proofErr w:type="spellEnd"/>
+            <w:r>
+              <w:rPr>
+                <w:rFonts w:ascii="Arial" w:hAnsi="Arial" w:cs="Arial"/>
+                <w:color w:val="0A0A0A"/>
+              </w:rPr>
+              <w:t>_{</w:t>
+            </w:r>
+            <w:r>
+              <w:rPr>
+                <w:rFonts w:ascii="Arial" w:hAnsi="Arial" w:cs="Arial"/>
+              </w:rPr>
+              <w:t>defendant2</w:t>
+            </w:r>
+            <w:proofErr w:type="gramStart"/>
+            <w:r>
+              <w:rPr>
+                <w:rFonts w:ascii="Arial" w:hAnsi="Arial" w:cs="Arial"/>
+              </w:rPr>
+              <w:t>Name!=</w:t>
+            </w:r>
+            <w:proofErr w:type="gramEnd"/>
+            <w:r>
+              <w:rPr>
+                <w:rFonts w:ascii="Arial" w:hAnsi="Arial" w:cs="Arial"/>
+              </w:rPr>
+              <w:t>null}</w:t>
             </w:r>
             <w:r>
               <w:rPr>
@@ -1083,7 +1235,19 @@
         <w:rPr>
           <w:rFonts w:ascii="Arial" w:hAnsi="Arial" w:cs="Arial"/>
         </w:rPr>
-        <w:t>Where this order, or any rule or practice direction, requires a party to file, serve or exchange a document which can be uploaded to the digital portal then the document must be uploaded to the digital portal (and need not separately be filed, served or exchanged).</w:t>
+        <w:t xml:space="preserve">Where this </w:t>
+      </w:r>
+      <w:r>
+        <w:rPr>
+          <w:rFonts w:ascii="Arial" w:hAnsi="Arial" w:cs="Arial"/>
+        </w:rPr>
+        <w:t>O</w:t>
+      </w:r>
+      <w:r>
+        <w:rPr>
+          <w:rFonts w:ascii="Arial" w:hAnsi="Arial" w:cs="Arial"/>
+        </w:rPr>
+        <w:t>rder, or any rule or practice direction, requires a party to file, serve or exchange a document which can be uploaded to the digital portal then the document must be uploaded to the digital portal (and need not separately be filed, served or exchanged).</w:t>
       </w:r>
     </w:p>
     <w:p>
@@ -1128,7 +1292,25 @@
           <w:kern w:val="0"/>
           <w14:ligatures w14:val="none"/>
         </w:rPr>
-        <w:t>This case is allocated to the Multi Track.</w:t>
+        <w:t xml:space="preserve">This case is allocated to the </w:t>
+      </w:r>
+      <w:r>
+        <w:rPr>
+          <w:rStyle w:val="ui-provider"/>
+          <w:rFonts w:ascii="Arial" w:eastAsia="Times New Roman" w:hAnsi="Arial" w:cs="Arial"/>
+          <w:kern w:val="0"/>
+          <w14:ligatures w14:val="none"/>
+        </w:rPr>
+        <w:t>multi-track</w:t>
+      </w:r>
+      <w:r>
+        <w:rPr>
+          <w:rStyle w:val="ui-provider"/>
+          <w:rFonts w:ascii="Arial" w:eastAsia="Times New Roman" w:hAnsi="Arial" w:cs="Arial"/>
+          <w:kern w:val="0"/>
+          <w14:ligatures w14:val="none"/>
+        </w:rPr>
+        <w:t>.</w:t>
       </w:r>
     </w:p>
     <w:p>
@@ -1343,8 +1525,19 @@
           <w:kern w:val="0"/>
           <w14:ligatures w14:val="none"/>
         </w:rPr>
-        <w:t xml:space="preserve"> [ ]</w:t>
-      </w:r>
+        <w:t xml:space="preserve"> </w:t>
+      </w:r>
+      <w:proofErr w:type="gramStart"/>
+      <w:r>
+        <w:rPr>
+          <w:rStyle w:val="ui-provider"/>
+          <w:rFonts w:ascii="Arial" w:eastAsia="Times New Roman" w:hAnsi="Arial" w:cs="Arial"/>
+          <w:kern w:val="0"/>
+          <w14:ligatures w14:val="none"/>
+        </w:rPr>
+        <w:t>[ ]</w:t>
+      </w:r>
+      <w:proofErr w:type="gramEnd"/>
       <w:r>
         <w:rPr>
           <w:rStyle w:val="ui-provider"/>
@@ -1607,7 +1800,25 @@
           <w:lang w:eastAsia="en-GB"/>
           <w14:ligatures w14:val="none"/>
         </w:rPr>
-        <w:t>The claimant shall not less than 3 clear days before the hearing upload to the digital portal a bundle which must:</w:t>
+        <w:t xml:space="preserve">The </w:t>
+      </w:r>
+      <w:r>
+        <w:rPr>
+          <w:rFonts w:ascii="Arial" w:eastAsia="Times New Roman" w:hAnsi="Arial" w:cs="Arial"/>
+          <w:kern w:val="0"/>
+          <w:lang w:eastAsia="en-GB"/>
+          <w14:ligatures w14:val="none"/>
+        </w:rPr>
+        <w:t>C</w:t>
+      </w:r>
+      <w:r>
+        <w:rPr>
+          <w:rFonts w:ascii="Arial" w:eastAsia="Times New Roman" w:hAnsi="Arial" w:cs="Arial"/>
+          <w:kern w:val="0"/>
+          <w:lang w:eastAsia="en-GB"/>
+          <w14:ligatures w14:val="none"/>
+        </w:rPr>
+        <w:t>laimant shall not less than 3 clear days before the hearing upload to the digital portal a bundle which must:</w:t>
       </w:r>
     </w:p>
     <w:p>
@@ -1641,7 +1852,17 @@
           <w:lang w:eastAsia="en-GB"/>
           <w14:ligatures w14:val="none"/>
         </w:rPr>
-        <w:t>ave a file name containing the type of hearing (e.g. CCMC) and the words “hearing bundle”</w:t>
+        <w:t>ave a file name containing the type of hearing (e.g. CCMC) and the words “hearing bundle</w:t>
+      </w:r>
+      <w:proofErr w:type="gramStart"/>
+      <w:r>
+        <w:rPr>
+          <w:rFonts w:ascii="Arial" w:eastAsia="Times New Roman" w:hAnsi="Arial" w:cs="Arial"/>
+          <w:kern w:val="0"/>
+          <w:lang w:eastAsia="en-GB"/>
+          <w14:ligatures w14:val="none"/>
+        </w:rPr>
+        <w:t>”</w:t>
       </w:r>
       <w:r>
         <w:rPr>
@@ -1652,6 +1873,7 @@
         </w:rPr>
         <w:t>;</w:t>
       </w:r>
+      <w:proofErr w:type="gramEnd"/>
     </w:p>
     <w:p>
       <w:pPr>
@@ -1821,7 +2043,27 @@
           <w:lang w:eastAsia="en-GB"/>
           <w14:ligatures w14:val="none"/>
         </w:rPr>
-        <w:t xml:space="preserve"> one page summary of the Precedents H of both parties to enable the judge to undertake a comparison of the total for each party of each phase of the litigation</w:t>
+        <w:t xml:space="preserve"> </w:t>
+      </w:r>
+      <w:proofErr w:type="gramStart"/>
+      <w:r>
+        <w:rPr>
+          <w:rFonts w:ascii="Arial" w:eastAsia="Times New Roman" w:hAnsi="Arial" w:cs="Arial"/>
+          <w:kern w:val="0"/>
+          <w:lang w:eastAsia="en-GB"/>
+          <w14:ligatures w14:val="none"/>
+        </w:rPr>
+        <w:t>one page</w:t>
+      </w:r>
+      <w:proofErr w:type="gramEnd"/>
+      <w:r>
+        <w:rPr>
+          <w:rFonts w:ascii="Arial" w:eastAsia="Times New Roman" w:hAnsi="Arial" w:cs="Arial"/>
+          <w:kern w:val="0"/>
+          <w:lang w:eastAsia="en-GB"/>
+          <w14:ligatures w14:val="none"/>
+        </w:rPr>
+        <w:t xml:space="preserve"> summary of the Precedents H of both parties to enable the judge to undertake a comparison of the total for each party of each phase of the litigation</w:t>
       </w:r>
     </w:p>
     <w:p>
@@ -1855,17 +2097,28 @@
           <w:lang w:eastAsia="en-GB"/>
           <w14:ligatures w14:val="none"/>
         </w:rPr>
-        <w:t xml:space="preserve"> breakdown of the pre-action and issue/pleadings costs included in the respective Forms H</w:t>
-      </w:r>
-      <w:r>
-        <w:rPr>
-          <w:rFonts w:ascii="Arial" w:eastAsia="Times New Roman" w:hAnsi="Arial" w:cs="Arial"/>
-          <w:kern w:val="0"/>
-          <w:lang w:eastAsia="en-GB"/>
-          <w14:ligatures w14:val="none"/>
-        </w:rPr>
-        <w:t xml:space="preserve"> ;</w:t>
-      </w:r>
+        <w:t xml:space="preserve"> breakdown of the pre-action and issue/pleadings costs included in the respective Forms </w:t>
+      </w:r>
+      <w:proofErr w:type="gramStart"/>
+      <w:r>
+        <w:rPr>
+          <w:rFonts w:ascii="Arial" w:eastAsia="Times New Roman" w:hAnsi="Arial" w:cs="Arial"/>
+          <w:kern w:val="0"/>
+          <w:lang w:eastAsia="en-GB"/>
+          <w14:ligatures w14:val="none"/>
+        </w:rPr>
+        <w:t>H</w:t>
+      </w:r>
+      <w:r>
+        <w:rPr>
+          <w:rFonts w:ascii="Arial" w:eastAsia="Times New Roman" w:hAnsi="Arial" w:cs="Arial"/>
+          <w:kern w:val="0"/>
+          <w:lang w:eastAsia="en-GB"/>
+          <w14:ligatures w14:val="none"/>
+        </w:rPr>
+        <w:t>;</w:t>
+      </w:r>
+      <w:proofErr w:type="gramEnd"/>
     </w:p>
     <w:p>
       <w:pPr>
@@ -1889,7 +2142,17 @@
           <w:lang w:eastAsia="en-GB"/>
           <w14:ligatures w14:val="none"/>
         </w:rPr>
-        <w:t>be indexed, paginated and bookmarked. The pagination should start at page 1 for the first page of the bundle and must run sequentially thereafter</w:t>
+        <w:t xml:space="preserve">be indexed, paginated and bookmarked. The pagination should start at page 1 for the first page of the bundle and must run sequentially </w:t>
+      </w:r>
+      <w:proofErr w:type="gramStart"/>
+      <w:r>
+        <w:rPr>
+          <w:rFonts w:ascii="Arial" w:eastAsia="Times New Roman" w:hAnsi="Arial" w:cs="Arial"/>
+          <w:kern w:val="0"/>
+          <w:lang w:eastAsia="en-GB"/>
+          <w14:ligatures w14:val="none"/>
+        </w:rPr>
+        <w:t>thereafter</w:t>
       </w:r>
       <w:r>
         <w:rPr>
@@ -1900,6 +2163,7 @@
         </w:rPr>
         <w:t>;</w:t>
       </w:r>
+      <w:proofErr w:type="gramEnd"/>
     </w:p>
     <w:p>
       <w:pPr>
@@ -1923,7 +2187,25 @@
           <w:lang w:eastAsia="en-GB"/>
           <w14:ligatures w14:val="none"/>
         </w:rPr>
-        <w:t>comply with paras 1-10 of the court’s general guidance on electronic court bundles</w:t>
+        <w:t xml:space="preserve">comply with paras 1-10 of the </w:t>
+      </w:r>
+      <w:r>
+        <w:rPr>
+          <w:rFonts w:ascii="Arial" w:eastAsia="Times New Roman" w:hAnsi="Arial" w:cs="Arial"/>
+          <w:kern w:val="0"/>
+          <w:lang w:eastAsia="en-GB"/>
+          <w14:ligatures w14:val="none"/>
+        </w:rPr>
+        <w:t>C</w:t>
+      </w:r>
+      <w:r>
+        <w:rPr>
+          <w:rFonts w:ascii="Arial" w:eastAsia="Times New Roman" w:hAnsi="Arial" w:cs="Arial"/>
+          <w:kern w:val="0"/>
+          <w:lang w:eastAsia="en-GB"/>
+          <w14:ligatures w14:val="none"/>
+        </w:rPr>
+        <w:t>ourt’s general guidance on electronic court bundles</w:t>
       </w:r>
       <w:r>
         <w:rPr>
@@ -1937,8 +2219,6 @@
       <w:r>
         <w:rPr>
           <w:rFonts w:ascii="Arial" w:eastAsia="Times New Roman" w:hAnsi="Arial" w:cs="Arial"/>
-          <w:sz w:val="24"/>
-          <w:szCs w:val="24"/>
           <w:lang w:val="en-US" w:eastAsia="en-GB"/>
         </w:rPr>
         <w:t>(</w:t>
@@ -1948,8 +2228,6 @@
           <w:rPr>
             <w:rFonts w:ascii="Arial" w:eastAsia="Times New Roman" w:hAnsi="Arial" w:cs="Arial"/>
             <w:color w:val="0563C1"/>
-            <w:sz w:val="24"/>
-            <w:szCs w:val="24"/>
             <w:u w:val="single" w:color="0563C0"/>
             <w:lang w:val="en-US" w:eastAsia="en-GB"/>
           </w:rPr>
@@ -1959,11 +2237,23 @@
       <w:r>
         <w:rPr>
           <w:rFonts w:ascii="Arial" w:eastAsia="Times New Roman" w:hAnsi="Arial" w:cs="Arial"/>
-          <w:sz w:val="24"/>
-          <w:szCs w:val="24"/>
-          <w:lang w:eastAsia="en-GB"/>
-        </w:rPr>
-        <w:t>) ;and</w:t>
+          <w:lang w:eastAsia="en-GB"/>
+        </w:rPr>
+        <w:t>);</w:t>
+      </w:r>
+      <w:r>
+        <w:rPr>
+          <w:rFonts w:ascii="Arial" w:eastAsia="Times New Roman" w:hAnsi="Arial" w:cs="Arial"/>
+          <w:lang w:eastAsia="en-GB"/>
+        </w:rPr>
+        <w:t xml:space="preserve"> </w:t>
+      </w:r>
+      <w:r>
+        <w:rPr>
+          <w:rFonts w:ascii="Arial" w:eastAsia="Times New Roman" w:hAnsi="Arial" w:cs="Arial"/>
+          <w:lang w:eastAsia="en-GB"/>
+        </w:rPr>
+        <w:t>and</w:t>
       </w:r>
     </w:p>
     <w:p>
@@ -2098,7 +2388,39 @@
           <w:kern w:val="0"/>
           <w14:ligatures w14:val="none"/>
         </w:rPr>
-        <w:t>[The claimant shall no less than 3 days before the hearing file at court a paper version of the bundle in addition to any electronic bundle prepared in accordance with the above paragraphs]</w:t>
+        <w:t xml:space="preserve">[The </w:t>
+      </w:r>
+      <w:r>
+        <w:rPr>
+          <w:rFonts w:ascii="Arial" w:eastAsia="Times New Roman" w:hAnsi="Arial" w:cs="Arial"/>
+          <w:kern w:val="0"/>
+          <w14:ligatures w14:val="none"/>
+        </w:rPr>
+        <w:t>C</w:t>
+      </w:r>
+      <w:r>
+        <w:rPr>
+          <w:rFonts w:ascii="Arial" w:eastAsia="Times New Roman" w:hAnsi="Arial" w:cs="Arial"/>
+          <w:kern w:val="0"/>
+          <w14:ligatures w14:val="none"/>
+        </w:rPr>
+        <w:t xml:space="preserve">laimant shall no less than 3 days before the hearing file at </w:t>
+      </w:r>
+      <w:r>
+        <w:rPr>
+          <w:rFonts w:ascii="Arial" w:eastAsia="Times New Roman" w:hAnsi="Arial" w:cs="Arial"/>
+          <w:kern w:val="0"/>
+          <w14:ligatures w14:val="none"/>
+        </w:rPr>
+        <w:t>C</w:t>
+      </w:r>
+      <w:r>
+        <w:rPr>
+          <w:rFonts w:ascii="Arial" w:eastAsia="Times New Roman" w:hAnsi="Arial" w:cs="Arial"/>
+          <w:kern w:val="0"/>
+          <w14:ligatures w14:val="none"/>
+        </w:rPr>
+        <w:t>ourt a paper version of the bundle in addition to any electronic bundle prepared in accordance with the above paragraphs]</w:t>
       </w:r>
     </w:p>
     <w:p>
@@ -2199,7 +2521,29 @@
           <w:lang w:eastAsia="en-GB"/>
           <w14:ligatures w14:val="none"/>
         </w:rPr>
-        <w:t>This order has been made without hearing. Each party has the right to apply to have</w:t>
+        <w:t xml:space="preserve">This </w:t>
+      </w:r>
+      <w:r>
+        <w:rPr>
+          <w:rFonts w:ascii="Arial" w:eastAsia="Times New Roman" w:hAnsi="Arial" w:cs="Arial"/>
+          <w:b/>
+          <w:bCs/>
+          <w:kern w:val="0"/>
+          <w:lang w:eastAsia="en-GB"/>
+          <w14:ligatures w14:val="none"/>
+        </w:rPr>
+        <w:t>O</w:t>
+      </w:r>
+      <w:r>
+        <w:rPr>
+          <w:rFonts w:ascii="Arial" w:eastAsia="Times New Roman" w:hAnsi="Arial" w:cs="Arial"/>
+          <w:b/>
+          <w:bCs/>
+          <w:kern w:val="0"/>
+          <w:lang w:eastAsia="en-GB"/>
+          <w14:ligatures w14:val="none"/>
+        </w:rPr>
+        <w:t>rder has been made without hearing. Each party has the right to apply to have</w:t>
       </w:r>
     </w:p>
     <w:p>
@@ -3639,7 +3983,6 @@
   <w:style w:type="character" w:default="1" w:styleId="DefaultParagraphFont">
     <w:name w:val="Default Paragraph Font"/>
     <w:uiPriority w:val="1"/>
-    <w:semiHidden/>
     <w:unhideWhenUsed/>
   </w:style>
   <w:style w:type="table" w:default="1" w:styleId="TableNormal">

</xml_diff>